<commit_message>
Fix generator: storylineThread, META id/name, safetyNotes, subject-aware template; regen chem_1_4
</commit_message>
<xml_diff>
--- a/data/outputs/docx/Grade 10 Chemistry/Chemistry 1.4/Chemistry_Chemical_Bonding_FinalExplanation.docx
+++ b/data/outputs/docx/Grade 10 Chemistry/Chemistry 1.4/Chemistry_Chemical_Bonding_FinalExplanation.docx
@@ -422,7 +422,7 @@
                 <w:sz w:val="18"/>
                 <w:szCs w:val="18"/>
               </w:rPr>
-              <w:t xml:space="preserve">You have spent eight lessons investigating the Gikomba Market mystery: why do table salt, graphite, diamond, and copper wire — all solid materials made of atoms — behave so differently in the real world? Now it is time to write your Final Explanation. Using your Summary Table of bond types and properties, the evidence you gathered during the physical property investigations in Lesson 6, the Lewis diagrams and structural models you built across the unit, and the class Driving Question Board, write a well-organised scientific explanation that solves the Gikomba mystery from beginning to end. Your explanation must do all of the following: (1) describe each of the four main bond types studied (ionic, covalent, metallic, and intermolecular forces), explaining how valence electrons behave in each; (2) link each bond type to the specific physical properties it produces — such as hardness, melting point, electrical conductivity, solubility, and malleability; (3) use the four Gikomba products (table salt, graphite pencil, diamond-tipped cutter, and copper wire) as your main evidence, referring to specific observations and results from investigations; (4) include at least two additional Kenyan real-world examples beyond the four Gikomba products; and (5) end with a reflection on why understanding chemical bonding matters for Kenyan industries, agriculture, or everyday life. Your response must be a minimum of 300 words and should be written in clear, precise scientific language. You may refer to your notebook, your Summary Table, and your model diagrams. Do not simply list facts — every claim you make must be supported by evidence or reasoning.</w:t>
+              <w:t xml:space="preserve">This is your Final Explanation task for Sub-Strand 1.4: Chemical Bonding. You have completed eight lessons investigating why sodium chloride, graphite, aluminium, and diamond behave so differently despite all being made of atoms held together by chemical bonds. Now it is time to bring all of your evidence and understanding together into one coherent, well-organised written explanation. Use your Summary Table from Lesson 7, your experimental observations from Lessons 3–7, and your final revised model from Lesson 8 to support every claim you make. Your explanation must directly address the driving question: 'How do the types of chemical bonds between atoms determine the structure, properties, and uses of the substances all around us?' You must connect your answer back to the anchoring phenomenon — the Form 4 student in Nairobi who noticed that salt, graphite, aluminium, and diamond all behave in puzzling and contrasting ways. Include specific Kenyan examples and real-world uses wherever possible (for example, NaCl in cooking ugali and githeri, aluminium in sufurias and matatu body panels, graphite in pencils used in KCSE exams, or industrial diamond used in mining drills in the Rift Valley). Your explanation must be a minimum of 300 words, written in clear scientific English, and must cover all four sections below. Use evidence from your experiments and observations — not just definitions — to justify your conclusions.</w:t>
             </w:r>
           </w:p>
         </w:tc>
@@ -483,7 +483,7 @@
                 <w:sz w:val="22"/>
                 <w:szCs w:val="22"/>
               </w:rPr>
-              <w:t xml:space="preserve">SECTION 1: THE GIKOMBA MYSTERY — SETTING UP THE PROBLEM</w:t>
+              <w:t xml:space="preserve">SECTION 1: EXPLAINING THE ANCHORING PHENOMENON</w:t>
             </w:r>
           </w:p>
         </w:tc>
@@ -517,7 +517,7 @@
                 <w:sz w:val="18"/>
                 <w:szCs w:val="18"/>
               </w:rPr>
-              <w:t xml:space="preserve">Describe the Gikomba Market phenomenon that started this unit. In your own words, explain what puzzle the four products — table salt, graphite pencil, diamond-tipped cutter, and copper wire — presented to you at the beginning of Lesson 1. What did all four products have in common on the surface, and what made their behaviour so puzzling? State the central question your investigation set out to answer and explain why you could not answer it just by looking at the materials from the outside.</w:t>
+              <w:t xml:space="preserve">Return to the original phenomenon. Explain why the Form 4 student in Nairobi observed such dramatic differences between sodium chloride, graphite, aluminium, and diamond. In your answer, identify the type of chemical bond present in each substance, describe the large-scale structure each bond type produces, and connect these structures to at least three contrasting properties the student observed (for example: solubility, electrical conductivity, hardness, melting point, malleability). Use specific evidence from your experiments or observations in Lesson 7 to support your claims.</w:t>
             </w:r>
           </w:p>
         </w:tc>
@@ -549,7 +549,7 @@
                 <w:sz w:val="18"/>
                 <w:szCs w:val="18"/>
               </w:rPr>
-              <w:t xml:space="preserve">At the start of this unit, we were introduced to a vendor at Gikomba Market in Nairobi who sells four very different products side by side. On the surface, all four — table salt, a graphite pencil, a diamond-tipped glass cutter, and a coil of copper wire — appear to be ordinary solid materials. You could hold each of them in your hand, and none of them would look obviously different from the others at first glance. Yet when you actually use these materials or test them in a laboratory, their behaviour is completely different. Salt dissolves easily in a cup of water and conducts electricity only after it has dissolved. The graphite pencil leaves marks on paper and can conduct electricity even as a dry solid. The diamond tip is so hard it scratches glass without breaking, yet it will not conduct electricity at all. The copper wire bends into any shape you choose, conducts electricity excellently, and can be drawn into a wire thinner than a human hair.</w:t>
+              <w:t xml:space="preserve">When the Form 4 student in Nairobi was helping prepare supper, she was unknowingly surrounded by four completely different types of bonding and structure. The table salt (sodium chloride) she dissolved in water contains ionic bonds — electrostatic forces of attraction between positively charged sodium ions (Na⁺) and negatively charged chloride ions (Cl⁻), arranged in a giant ionic lattice. Because this lattice is held together by strong electrostatic forces in all directions, NaCl has a high melting point, but when placed in water, the polar water molecules are able to pull the ions apart from the surface of the lattice, so it dissolves readily. Once dissolved, the free-moving ions carry electrical charge, which is why the solution conducts electricity. In our Lesson 7 experiment, we confirmed that solid NaCl did not conduct electricity but its aqueous solution did — exactly matching this explanation.</w:t>
             </w:r>
           </w:p>
           <w:p>
@@ -587,7 +587,7 @@
                 <w:sz w:val="18"/>
                 <w:szCs w:val="18"/>
               </w:rPr>
-              <w:t xml:space="preserve">The puzzle was this: if all four materials are made of atoms, and if all four are solid at room temperature, what causes such dramatically different behaviour? Looking at the outside of a material cannot tell you anything about what is happening between the atoms inside. You cannot see atoms with the naked eye, and you cannot see the forces holding them together. This means the answer had to be found at the invisible, atomic level. Our central investigation question became: why do atoms in different substances bond in different ways, and how does the type of bond determine what a substance looks, feels, and does in the real world? This question drove every lesson, every experiment, and every model we built during this unit.</w:t>
+              <w:t xml:space="preserve">The graphite in the student's pencil and the diamond she recalled from her class trip are both made entirely of carbon atoms, yet they behave in opposite ways because their bonding structures are completely different. Graphite has a giant covalent layered structure: each carbon atom forms three strong covalent bonds with neighbouring carbon atoms in flat hexagonal layers. The fourth valence electron on each carbon atom is delocalised across the entire layer, forming a 'sea' of mobile electrons — this is why graphite conducts electricity, just like a metal. The layers are held together only by weak van der Waals forces, so they slide over each other easily, making graphite slippery and soft enough to leave marks on paper. Diamond, by contrast, has a giant covalent network structure in which every carbon atom forms four strong covalent bonds in a rigid three-dimensional tetrahedral arrangement. There are no free electrons and no weak interlayer forces, so diamond does not conduct electricity and is exceptionally hard — the hardest natural substance known. The aluminium sufuria conducts heat and electricity and can be beaten into shape because aluminium has metallic bonding: a lattice of positive aluminium ions (Al³⁺) surrounded by a 'sea' of delocalised electrons. These mobile electrons carry both heat and electrical current, while the non-directional nature of metallic bonds allows layers of ions to slide without breaking, making aluminium malleable.</w:t>
             </w:r>
           </w:p>
         </w:tc>
@@ -648,7 +648,7 @@
                 <w:sz w:val="22"/>
                 <w:szCs w:val="22"/>
               </w:rPr>
-              <w:t xml:space="preserve">SECTION 2: IONIC AND COVALENT BONDING — ELECTRONS TRANSFERRED OR SHARED</w:t>
+              <w:t xml:space="preserve">SECTION 2: THE FOUR TYPES OF CHEMICAL BONDS AND THEIR STRUCTURES</w:t>
             </w:r>
           </w:p>
         </w:tc>
@@ -682,7 +682,7 @@
                 <w:sz w:val="18"/>
                 <w:szCs w:val="18"/>
               </w:rPr>
-              <w:t xml:space="preserve">Explain how ionic bonding forms, using sodium chloride (table salt) as your main example. Draw on your Lewis diagram work to describe what happens to the valence electrons of sodium and chlorine when they bond, and explain the structure of the ionic lattice that results. Then explain covalent bonding, contrasting it clearly with ionic bonding. Use diamond and graphite as your two covalent examples, and explain why two substances that are both made entirely of carbon atoms have such dramatically different properties — one being the hardest known substance and the other being soft enough to leave marks on paper. Mention dative covalent bonding if it applies to any molecule you studied.</w:t>
+              <w:t xml:space="preserve">Explain the four main types of chemical bonding covered in this unit: ionic bonding, covalent bonding (including dative covalent bonding), metallic bonding, and intermolecular forces (hydrogen bonds and van der Waals forces). For each bond type, describe how the bond forms at the atomic level, what large-scale structure results, and give at least one specific Kenyan or everyday example of a substance that has that bond type. Ensure you explain the difference between giant structures and simple molecular structures for covalent substances.</w:t>
             </w:r>
           </w:p>
         </w:tc>
@@ -714,7 +714,7 @@
                 <w:sz w:val="18"/>
                 <w:szCs w:val="18"/>
               </w:rPr>
-              <w:t xml:space="preserve">Ionic bonding forms when one atom transfers one or more valence electrons to another atom, producing oppositely charged ions that attract each other strongly. In sodium chloride — the table salt sold in Gikomba Market — sodium has one valence electron in its outer shell. Chlorine has seven valence electrons and needs one more to complete its outer shell. Sodium transfers its single valence electron to chlorine, producing a sodium ion with a positive charge (Na⁺) and a chloride ion with a negative charge (Cl⁻). These oppositely charged ions arrange themselves into a giant ionic lattice — a repeating three-dimensional structure in which every Na⁺ ion is surrounded by six Cl⁻ ions and vice versa. This strong electrostatic attraction between opposite charges gives ionic compounds high melting points. However, when salt dissolves in water, the lattice breaks apart and the ions become free to move, which is why dissolved salt conducts electricity but solid salt does not.</w:t>
+              <w:t xml:space="preserve">Ionic bonding occurs when one or more electrons are completely transferred from a metal atom to a non-metal atom. The metal atom loses electrons to become a positively charged cation, and the non-metal atom gains electrons to become a negatively charged anion. The opposite charges attract each other by strong electrostatic forces in all directions, building up a giant ionic lattice. Sodium chloride — the salt we add to water when boiling githeri — is the classic example: sodium transfers one electron to chlorine, forming Na⁺ and Cl⁻ ions arranged in a face-centred cubic lattice. The strength of this lattice gives NaCl a high melting point (801 °C) and makes it a crystalline solid at room temperature.</w:t>
             </w:r>
           </w:p>
           <w:p>
@@ -752,7 +752,7 @@
                 <w:sz w:val="18"/>
                 <w:szCs w:val="18"/>
               </w:rPr>
-              <w:t xml:space="preserve">Covalent bonding is completely different. Instead of transferring electrons, atoms share pairs of valence electrons between them. Both carbon allotropes — diamond and graphite — consist entirely of carbon atoms joined by covalent bonds, yet their structures and properties are astonishingly different. In diamond, each carbon atom forms four strong covalent bonds with four neighbouring carbon atoms in a giant tetrahedral lattice that extends in all directions. Every single electron is locked into a bond, leaving no free electrons to carry electrical charge. This rigid, three-dimensional network makes diamond the hardest naturally occurring substance and explains why the diamond-tipped cutter at Gikomba can scratch glass. In graphite, each carbon atom forms only three covalent bonds, creating flat hexagonal layers. The fourth valence electron from each carbon is delocalised — it is free to move between the layers — which is why graphite conducts electricity. The layers themselves are held together only by weak van der Waals forces, so they slide easily over one another, leaving marks on paper. Dative covalent bonds — where both electrons in the shared pair come from only one atom — appear in molecules such as the ammonium ion, where the nitrogen atom donates a lone pair to a hydrogen ion.</w:t>
+              <w:t xml:space="preserve">Covalent bonding forms when two non-metal atoms share pairs of electrons so that each atom achieves a full outer shell. A simple covalent molecule like water (H₂O) — which Kenyans boil every day to make tea in Kericho or uji in Kisumu — consists of small, discrete molecules. The covalent bonds within each molecule are strong, but the intermolecular forces between molecules (van der Waals forces and, in water's case, hydrogen bonds) are relatively weak, giving simple covalent substances low melting and boiling points. A dative covalent bond is a special case where both electrons in the shared pair come from the same atom, as seen in the ammonium ion (NH₄⁺). Giant covalent structures, such as diamond and graphite, also involve covalent bonding but extend continuously in two or three dimensions, producing substances with very high melting points. Metallic bonding, found in aluminium, copper, and iron, consists of a regular lattice of positive metal ions held together by a delocalised sea of electrons. Intermolecular forces — including van der Waals forces and hydrogen bonds — act between molecules rather than within them and explain why substances like candle wax (used in many Kenyan homes during power cuts) melt at low temperatures, while water has an unusually high boiling point for its small molecular size.</w:t>
             </w:r>
           </w:p>
         </w:tc>
@@ -813,7 +813,7 @@
                 <w:sz w:val="22"/>
                 <w:szCs w:val="22"/>
               </w:rPr>
-              <w:t xml:space="preserve">SECTION 3: METALLIC BONDING — THE SEA OF ELECTRONS</w:t>
+              <w:t xml:space="preserve">SECTION 3: BOND TYPE, STRUCTURE, AND PHYSICAL PROPERTIES</w:t>
             </w:r>
           </w:p>
         </w:tc>
@@ -847,7 +847,7 @@
                 <w:sz w:val="18"/>
                 <w:szCs w:val="18"/>
               </w:rPr>
-              <w:t xml:space="preserve">Explain the metallic bonding model in detail, using copper wire as your main example. Describe what happens to the valence electrons of copper atoms in the metallic lattice, and use this model to explain at least three properties of copper: electrical conductivity, malleability and ductility, and metallic lustre. Extend your explanation to at least one other Kenyan context involving metals — for example, the iron jembe (hoe) used by farmers in the Rift Valley, steel roofing sheets in Kibera, or aluminium sufurias used for cooking ugali.</w:t>
+              <w:t xml:space="preserve">Explain how the type of chemical bond and the resulting structure directly determine the physical properties of a substance. Your explanation must address at least four properties: melting point, electrical conductivity, solubility in water, and either hardness or malleability. For each property, explain the particle-level reason why different bond types produce different behaviour. Use data or observations from your experiments in Lessons 3–7 as evidence. Where possible, compare two or more substances to show how differences in bonding lead to differences in properties.</w:t>
             </w:r>
           </w:p>
         </w:tc>
@@ -879,7 +879,7 @@
                 <w:sz w:val="18"/>
                 <w:szCs w:val="18"/>
               </w:rPr>
-              <w:t xml:space="preserve">In metallic bonding, the valence electrons of metal atoms are not held by any single atom or shared between just two atoms. Instead, the atoms lose their valence electrons and become positive ions arranged in a regular lattice, while the released electrons form a 'sea' or 'cloud' of delocalised electrons that moves freely throughout the entire structure. This model, which we built in Lesson 5, explains why the copper wire at Gikomba behaves the way it does.</w:t>
+              <w:t xml:space="preserve">The physical properties of any substance are determined by two things working together: the type of bond present and the large-scale structure those bonds produce. Melting point is a good starting point. To melt a solid, you must supply enough energy to overcome the forces holding its particles together. In a giant ionic lattice like NaCl, the electrostatic attractions between ions in all directions are strong, so a large amount of energy is needed — NaCl melts at 801 °C. In a giant covalent structure like diamond, you must break strong covalent bonds throughout the entire three-dimensional network, requiring even more energy (diamond melts above 3 500 °C). By contrast, a simple covalent molecule like candle wax only requires energy to overcome weak van der Waals forces between molecules — the covalent bonds inside each molecule are not broken during melting — so wax melts at a low temperature, well below 100 °C. In our Lesson 7 investigation, we observed that substances with giant structures (ionic or covalent) had significantly higher melting points than simple molecular substances, which matched this particle-level reasoning.</w:t>
             </w:r>
           </w:p>
           <w:p>
@@ -917,45 +917,7 @@
                 <w:sz w:val="18"/>
                 <w:szCs w:val="18"/>
               </w:rPr>
-              <w:t xml:space="preserve">Electrical conductivity in copper is explained directly by the sea of electrons. When a voltage is applied across the wire, the delocalised electrons can move freely from one end to the other, carrying electrical charge with them. There are no bonds to break and no lattice to disrupt — the electrons simply flow. This is why copper is the standard material for electrical wiring across Kenya, from homes in Westlands, Nairobi, to rural electrification projects in western Kenya. Malleability and ductility arise because the positive ions in the metallic lattice are not bonded to each other directly — they are held in place by the surrounding electron sea. When a force is applied, the layers of ions slide past one another while the electron sea adjusts instantly around them, maintaining the attraction. The bonds do not break, which is why copper wire can be bent, hammered, and drawn into thin strands without shattering. Metallic lustre occurs because the free electrons absorb light energy and re-emit it, giving metals their characteristic shiny appearance.</w:t>
-            </w:r>
-          </w:p>
-          <w:p>
-            <w:pPr>
-              <w:spacing w:after="40" w:before="0"/>
-              <w:jc w:val="left"/>
-            </w:pPr>
-            <w:r>
-              <w:rPr>
-                <w:rFonts w:ascii="Arial" w:cs="Arial" w:eastAsia="Arial" w:hAnsi="Arial"/>
-                <w:b w:val="false"/>
-                <w:bCs w:val="false"/>
-                <w:i w:val="false"/>
-                <w:iCs w:val="false"/>
-                <w:color w:val="000000"/>
-                <w:sz w:val="18"/>
-                <w:szCs w:val="18"/>
-              </w:rPr>
-              <w:t xml:space="preserve"/>
-            </w:r>
-          </w:p>
-          <w:p>
-            <w:pPr>
-              <w:spacing w:after="40" w:before="0"/>
-              <w:jc w:val="left"/>
-            </w:pPr>
-            <w:r>
-              <w:rPr>
-                <w:rFonts w:ascii="Arial" w:cs="Arial" w:eastAsia="Arial" w:hAnsi="Arial"/>
-                <w:b w:val="false"/>
-                <w:bCs w:val="false"/>
-                <w:i w:val="false"/>
-                <w:iCs w:val="false"/>
-                <w:color w:val="000000"/>
-                <w:sz w:val="18"/>
-                <w:szCs w:val="18"/>
-              </w:rPr>
-              <w:t xml:space="preserve">The same metallic bonding model explains the properties of other metals in Kenyan daily life. The iron jembe used by maize and bean farmers in the Rift Valley is hard enough to break soil but can be hammered into shape at a forge because iron's metallic bonds allow plastic deformation. Aluminium sufurias used to cook ugali and githeri in Kenyan kitchens are lightweight, conduct heat rapidly because delocalised electrons transfer thermal energy efficiently, and can be pressed into shape — all consequences of metallic bonding.</w:t>
+              <w:t xml:space="preserve">Electrical conductivity depends on whether a substance contains charged particles that are free to move. In solid NaCl, the ions are fixed in the lattice and cannot move, so it does not conduct electricity — we confirmed this with the conductivity apparatus in our experiment. When NaCl is dissolved in water or melted, the ions become free to move and carry current. Metallic substances like the aluminium sufuria conduct electricity in the solid state because the delocalised electrons are always free to flow. Graphite is unusual among covalent substances because its delocalised electrons within each layer allow it to conduct electricity, unlike diamond where all electrons are localised in covalent bonds. Solubility follows the principle 'like dissolves like': ionic compounds such as NaCl dissolve in polar water because water molecules attract and separate the ions, but giant covalent structures like graphite and diamond do not dissolve because water cannot overcome the strong covalent bonds. Hardness and malleability distinguish giant covalent from metallic structures: diamond is the hardest substance because breaking it requires snapping strong covalent bonds throughout the network, whereas aluminium is malleable because the non-directional sea of electrons allows layers of ions to slide past each other without the structure falling apart.</w:t>
             </w:r>
           </w:p>
         </w:tc>
@@ -1016,7 +978,7 @@
                 <w:sz w:val="22"/>
                 <w:szCs w:val="22"/>
               </w:rPr>
-              <w:t xml:space="preserve">SECTION 4: INTERMOLECULAR FORCES — THE HIDDEN BONDS BETWEEN MOLECULES</w:t>
+              <w:t xml:space="preserve">SECTION 4: BOND TYPE, STRUCTURE, AND THE USES OF SUBSTANCES IN KENYA AND BEYOND</w:t>
             </w:r>
           </w:p>
         </w:tc>
@@ -1050,7 +1012,7 @@
                 <w:sz w:val="18"/>
                 <w:szCs w:val="18"/>
               </w:rPr>
-              <w:t xml:space="preserve">Explain the difference between intramolecular bonds (bonds within a molecule) and intermolecular forces (forces between molecules). Describe hydrogen bonding and van der Waals forces, explaining how each arises and what properties each produces. Use water as your main example for hydrogen bonding — explain why water has an unusually high boiling point compared to other small molecules — and connect this to a Kenyan context such as cooking, Lake Victoria, or the water cycle in the Rift Valley. Include at least one example of a molecular solid with only van der Waals forces and explain how its low melting point reflects the weakness of those forces.</w:t>
+              <w:t xml:space="preserve">Explain how the properties arising from each bond type make specific substances suited to particular uses. Give at least four specific examples of substances and their uses, and for each one explain the chain of reasoning: bond type → structure → property → use. At least two of your examples must be drawn from Kenyan everyday life or Kenyan industries (for example: cooking, construction, agriculture, mining, healthcare, or school materials). You should also address the key inquiry question: How do the uses of a substance relate to its bond type and resultant structure?</w:t>
             </w:r>
           </w:p>
         </w:tc>
@@ -1082,7 +1044,7 @@
                 <w:sz w:val="18"/>
                 <w:szCs w:val="18"/>
               </w:rPr>
-              <w:t xml:space="preserve">Throughout this unit we have distinguished carefully between two types of attractions: intramolecular bonds — the strong forces holding atoms together inside a molecule, such as covalent bonds — and intermolecular forces — the weaker forces acting between separate molecules. Even though intermolecular forces are weaker than covalent or ionic bonds, they have a profound effect on physical properties such as boiling point, melting point, and solubility.</w:t>
+              <w:t xml:space="preserve">Understanding why a substance is used for a particular purpose requires following a clear chain of reasoning from bond type to structure to property to use. Aluminium is perhaps the most visible example in everyday Kenyan life. Aluminium has metallic bonding — a lattice of Al³⁺ ions surrounded by a sea of delocalised electrons. This structure makes aluminium an excellent conductor of heat (the delocalised electrons transfer kinetic energy rapidly) and mechanically malleable (the ion layers can slide). As a result, aluminium is ideal for making sufurias and cooking pots used in homes across Nairobi, Kisumu, and Mombasa: it heats food quickly and evenly, can be beaten or pressed into curved shapes without cracking, and is lightweight enough to handle easily. Aluminium is also used in matatu and bus body panels along Kenyan highways for the same reasons: it can be shaped into complex curved forms and does not corrode rapidly.</w:t>
             </w:r>
           </w:p>
           <w:p>
@@ -1120,45 +1082,7 @@
                 <w:sz w:val="18"/>
                 <w:szCs w:val="18"/>
               </w:rPr>
-              <w:t xml:space="preserve">Hydrogen bonding is a special, relatively strong type of intermolecular force that forms when a hydrogen atom is covalently bonded to a highly electronegative atom such as oxygen, nitrogen, or fluorine. In water, the oxygen atom pulls electron density away from the two hydrogen atoms, creating a partially negative oxygen end (δ⁻) and partially positive hydrogen ends (δ⁺). These partial charges allow water molecules to attract one another strongly through hydrogen bonds. Because of this network of hydrogen bonds, a large amount of energy is needed to separate water molecules from each other during boiling, giving water an anomalously high boiling point of 100°C — far higher than you would predict for such a small molecule. This has enormous consequences for life in Kenya: Lake Victoria, which supports millions of Kenyan fishing families and regulates the regional climate, exists as a liquid lake rather than a gas because of hydrogen bonding. Ugali and rice cook properly because water remains liquid at cooking temperatures, transferring heat efficiently to the food. If water had no hydrogen bonds, it would boil at around –80°C and Kenya's rivers, lakes, and rainfall would be impossible.</w:t>
-            </w:r>
-          </w:p>
-          <w:p>
-            <w:pPr>
-              <w:spacing w:after="40" w:before="0"/>
-              <w:jc w:val="left"/>
-            </w:pPr>
-            <w:r>
-              <w:rPr>
-                <w:rFonts w:ascii="Arial" w:cs="Arial" w:eastAsia="Arial" w:hAnsi="Arial"/>
-                <w:b w:val="false"/>
-                <w:bCs w:val="false"/>
-                <w:i w:val="false"/>
-                <w:iCs w:val="false"/>
-                <w:color w:val="000000"/>
-                <w:sz w:val="18"/>
-                <w:szCs w:val="18"/>
-              </w:rPr>
-              <w:t xml:space="preserve"/>
-            </w:r>
-          </w:p>
-          <w:p>
-            <w:pPr>
-              <w:spacing w:after="40" w:before="0"/>
-              <w:jc w:val="left"/>
-            </w:pPr>
-            <w:r>
-              <w:rPr>
-                <w:rFonts w:ascii="Arial" w:cs="Arial" w:eastAsia="Arial" w:hAnsi="Arial"/>
-                <w:b w:val="false"/>
-                <w:bCs w:val="false"/>
-                <w:i w:val="false"/>
-                <w:iCs w:val="false"/>
-                <w:color w:val="000000"/>
-                <w:sz w:val="18"/>
-                <w:szCs w:val="18"/>
-              </w:rPr>
-              <w:t xml:space="preserve">Van der Waals forces (also called London dispersion forces) are much weaker, temporary attractions that form between all molecules when instantaneous fluctuations in electron distribution create temporary dipoles. A good example is iodine, which forms a molecular solid held together only by van der Waals forces. Because these forces are so weak, iodine has a low melting point and sublimes easily at room temperature. Similarly, candle wax — used widely in Kenya during power outages — is a mixture of long hydrocarbon chains held together by van der Waals forces, which is why it melts at a relatively low temperature when a flame is applied.</w:t>
+              <w:t xml:space="preserve">Sodium chloride has ionic bonding and a giant ionic lattice. This gives it a high melting point, crystalline structure, and — critically — the ability to dissolve in water and preserve food by drawing moisture out of bacterial cells through osmosis. For centuries, salt has been used across Kenya to preserve nyama choma, fish from Lake Victoria, and vegetables. When dissolved, its ions also make it useful as an electrolyte in oral rehydration solutions used in Kenyan health centres. Graphite's giant covalent layered structure, with delocalised electrons within layers and weak van der Waals forces between them, makes it ideal for pencils used by Kenyan students sitting KCSE examinations: the layers slide off onto paper easily, leaving a visible mark. The same conductivity property makes graphite useful as electrodes in industrial electrolysis. Diamond's giant three-dimensional covalent network gives it unmatched hardness, making industrial-grade diamond the material of choice for drill tips used in mining and geological exploration in Kenya's Rift Valley region, where hard rock must be bored through efficiently. These examples confirm the answer to our key inquiry question: every practical use of a substance can be traced directly back to the type of bond it contains and the structure that bond produces.</w:t>
             </w:r>
           </w:p>
         </w:tc>
@@ -1219,7 +1143,7 @@
                 <w:sz w:val="22"/>
                 <w:szCs w:val="22"/>
               </w:rPr>
-              <w:t xml:space="preserve">SECTION 5: THE VERDICT — SOLVING THE GIKOMBA MYSTERY AND WHY IT MATTERS</w:t>
+              <w:t xml:space="preserve">SECTION 5: ANSWERING THE DRIVING QUESTION</w:t>
             </w:r>
           </w:p>
         </w:tc>
@@ -1253,7 +1177,7 @@
                 <w:sz w:val="18"/>
                 <w:szCs w:val="18"/>
               </w:rPr>
-              <w:t xml:space="preserve">Return to the four Gikomba products and give a complete, evidence-based verdict that solves the mystery. For each product, state the bond type present and use it to explain the key properties you observed or measured during the Lesson 6 investigations. Then write a reflection (at least one paragraph) on why understanding chemical bonding matters for Kenya — consider industries such as construction, agriculture, medicine, or energy. Mention at least one Kenyan scientist, engineer, or innovator, or refer to a Kenyan institution or research initiative related to materials science or chemistry.</w:t>
+              <w:t xml:space="preserve">Write a concise but complete answer to the driving question of this unit: 'How do the types of chemical bonds between atoms determine the structure, properties, and uses of the substances all around us?' Your answer should synthesise everything you have learned across all eight lessons. Explain the key principle that links bond type → structure → properties → uses, identify which aspects of this unit most surprised or challenged you, and reflect on how your understanding has changed from Lesson 1 (when you first observed the phenomenon) to now. Your answer must show that you can reason beyond memorised facts to explain new, unfamiliar substances using the principles you have learned.</w:t>
             </w:r>
           </w:p>
         </w:tc>
@@ -1285,7 +1209,7 @@
                 <w:sz w:val="18"/>
                 <w:szCs w:val="18"/>
               </w:rPr>
-              <w:t xml:space="preserve">We can now return to Gikomba Market with a complete scientific verdict. The table salt in the paper bag contains sodium and chloride ions held in a giant ionic lattice by strong electrostatic forces. This explains every property we tested: it is hard and brittle (the lattice is rigid but shatters when struck because layers of like charges repel), it dissolves in water (polar water molecules pull the ions apart), and it conducts electricity only in solution (ions must be free to move). The graphite pencil contains carbon atoms in layered sheets joined by covalent bonds within each layer and held between layers by weak van der Waals forces. Delocalised electrons between the layers conduct electricity, and the layers slide apart easily, leaving graphite marks on paper. The diamond-tipped cutter contains carbon atoms in a giant covalent tetrahedral lattice with no free electrons and no planes of weakness — this produces extreme hardness and zero electrical conductivity, exactly matching our observations. The copper wire contains copper ions in a metallic lattice surrounded by a sea of delocalised electrons — this produces excellent electrical conductivity, malleability, ductility, and a shiny metallic surface. Every mystery is solved by looking at what the valence electrons are doing inside the material.</w:t>
+              <w:t xml:space="preserve">The driving question of this unit — how do the types of chemical bonds between atoms determine the structure, properties, and uses of substances all around us? — has a clear and powerful answer: the type of bond formed between atoms determines the arrangement of those atoms at the microscopic level (the structure), and it is this structure that controls every property we can observe or measure, which in turn dictates every use humans make of that substance. This chain — bond type → structure → properties → uses — is the central principle of chemical bonding, and it explains everything from why the Nairobi student's salt dissolved in water to why diamond-tipped drills can bore through the hardest rock in the Rift Valley.</w:t>
             </w:r>
           </w:p>
           <w:p>
@@ -1323,7 +1247,45 @@
                 <w:sz w:val="18"/>
                 <w:szCs w:val="18"/>
               </w:rPr>
-              <w:t xml:space="preserve">Understanding chemical bonding is not merely an academic exercise — it has direct consequences for Kenya's development. Kenya's construction industry depends on steel (metallic bonding giving strength and ductility) and cement (ionic and covalent compounds giving hardness). Kenyan farmers rely on fertilisers such as calcium ammonium nitrate, whose ionic and covalent structures determine how they dissolve in soil water and release nutrients to maize and tea crops in Kericho and Nakuru. The medical sector uses knowledge of molecular bonding to design drugs that interact with specific receptor molecules in the human body. Kenya's growing solar energy industry depends on silicon semiconductors, whose unique bonding structure allows controlled electrical conductivity. Researchers at institutions such as the University of Nairobi's Department of Chemistry and the Kenya Industrial Research and Development Institute (KIRDI) apply bonding principles to develop new materials for water purification, food preservation, and renewable energy. The invisible world of chemical bonds is, in truth, the foundation upon which the visible, practical world of Kenyan industry and daily life is built.</w:t>
+              <w:t xml:space="preserve">At the start of Lesson 1, I could observe the differences between salt, graphite, diamond, and aluminium, but I had no framework to explain them. I might have guessed that 'stronger' bonds always meant 'harder' substances, or that all conductors must be metals. By working through all eight lessons, I now understand that the key variable is not just bond strength but bond type and the resulting structure. Two substances can both have strong covalent bonds — graphite and diamond — yet behave in completely opposite ways because one has a layered two-dimensional structure and the other has a three-dimensional network. This surprised me greatly during Lesson 6.</w:t>
+            </w:r>
+          </w:p>
+          <w:p>
+            <w:pPr>
+              <w:spacing w:after="40" w:before="0"/>
+              <w:jc w:val="left"/>
+            </w:pPr>
+            <w:r>
+              <w:rPr>
+                <w:rFonts w:ascii="Arial" w:cs="Arial" w:eastAsia="Arial" w:hAnsi="Arial"/>
+                <w:b w:val="false"/>
+                <w:bCs w:val="false"/>
+                <w:i w:val="false"/>
+                <w:iCs w:val="false"/>
+                <w:color w:val="000000"/>
+                <w:sz w:val="18"/>
+                <w:szCs w:val="18"/>
+              </w:rPr>
+              <w:t xml:space="preserve"/>
+            </w:r>
+          </w:p>
+          <w:p>
+            <w:pPr>
+              <w:spacing w:after="40" w:before="0"/>
+              <w:jc w:val="left"/>
+            </w:pPr>
+            <w:r>
+              <w:rPr>
+                <w:rFonts w:ascii="Arial" w:cs="Arial" w:eastAsia="Arial" w:hAnsi="Arial"/>
+                <w:b w:val="false"/>
+                <w:bCs w:val="false"/>
+                <w:i w:val="false"/>
+                <w:iCs w:val="false"/>
+                <w:color w:val="000000"/>
+                <w:sz w:val="18"/>
+                <w:szCs w:val="18"/>
+              </w:rPr>
+              <w:t xml:space="preserve">If I were presented with an unfamiliar substance — for example, silicon carbide (SiC), used to coat the edges of cutting tools used by Kenyan jua kali metalworkers — I could now reason as follows: silicon and carbon are both non-metals, so they form covalent bonds; silicon carbide forms a giant three-dimensional covalent network (similar to diamond); therefore it should have a very high melting point, great hardness, no electrical conductivity, and no solubility in water — and indeed it is one of the hardest known materials. This ability to predict and explain properties from first principles, rather than memorising facts about individual substances, is the most important thing I have gained from this unit. Chemical bonding is not just a topic in a chemistry textbook; it is the explanation for why every material in Kenya — and in the entire world — behaves the way it does.</w:t>
             </w:r>
           </w:p>
         </w:tc>
@@ -1550,7 +1512,7 @@
                 <w:sz w:val="18"/>
                 <w:szCs w:val="18"/>
               </w:rPr>
-              <w:t xml:space="preserve">Explanation of Bond Types and Valence Electron Behaviour</w:t>
+              <w:t xml:space="preserve">Explanation of Bond Types and Structures</w:t>
             </w:r>
           </w:p>
         </w:tc>
@@ -1582,7 +1544,7 @@
                 <w:sz w:val="18"/>
                 <w:szCs w:val="18"/>
               </w:rPr>
-              <w:t xml:space="preserve">Excellent (4): Accurately and thoroughly explains all four bond types (ionic, covalent including giant covalent, metallic, and intermolecular forces). Clearly describes what valence electrons do in each type — transferred, shared, delocalised, or involved in dipole attractions. Uses precise scientific vocabulary throughout (e.g., electrostatic attraction, delocalised electrons, electron sea, polar covalent, hydrogen bond donor/acceptor). No misconceptions present.</w:t>
+              <w:t xml:space="preserve">Excellent (4): Accurately and thoroughly explains all four bond types (ionic, covalent including dative, metallic, and intermolecular forces) with correct particle-level descriptions. Clearly distinguishes giant ionic, giant covalent, simple molecular, and metallic structures. Uses correct scientific vocabulary consistently (lattice, delocalised, electrostatic, octet, etc.).</w:t>
             </w:r>
           </w:p>
         </w:tc>
@@ -1614,7 +1576,7 @@
                 <w:sz w:val="18"/>
                 <w:szCs w:val="18"/>
               </w:rPr>
-              <w:t xml:space="preserve">Proficient (3): Accurately explains at least three bond types with correct descriptions of valence electron behaviour. Scientific vocabulary is mostly accurate with minor omissions. One bond type may lack depth but contains no serious errors.</w:t>
+              <w:t xml:space="preserve">Proficient (3): Accurately explains at least three bond types with mostly correct particle-level descriptions. Distinguishes between most structure types with minor omissions or imprecision. Uses scientific vocabulary mostly correctly with occasional errors.</w:t>
             </w:r>
           </w:p>
         </w:tc>
@@ -1646,7 +1608,7 @@
                 <w:sz w:val="18"/>
                 <w:szCs w:val="18"/>
               </w:rPr>
-              <w:t xml:space="preserve">Developing (1-2): Explains one or two bond types with partial accuracy. Valence electron behaviour is described vaguely or incorrectly for at least one bond type (e.g., confuses sharing and transferring, or states that ionic compounds conduct electricity as solids). Limited or incorrect use of scientific vocabulary.</w:t>
+              <w:t xml:space="preserve">Developing (1-2): Explains one or two bond types with significant inaccuracies or confuses bond types with each other. Descriptions are largely at the definition level without particle-level reasoning. Scientific vocabulary is limited or frequently misused.</w:t>
             </w:r>
           </w:p>
         </w:tc>
@@ -1680,7 +1642,7 @@
                 <w:sz w:val="18"/>
                 <w:szCs w:val="18"/>
               </w:rPr>
-              <w:t xml:space="preserve">Linking Bond Type to Physical Properties with Evidence</w:t>
+              <w:t xml:space="preserve">Linking Bond Type and Structure to Physical Properties</w:t>
             </w:r>
           </w:p>
         </w:tc>
@@ -1712,7 +1674,7 @@
                 <w:sz w:val="18"/>
                 <w:szCs w:val="18"/>
               </w:rPr>
-              <w:t xml:space="preserve">Excellent (4): Consistently and specifically links each bond type to at least two physical properties (e.g., melting point, conductivity, hardness, solubility, malleability). References specific observations or quantitative data from the Lesson 6 practical investigations to support each claim. Explains the causal mechanism — not just correlation — between bond type and property.</w:t>
+              <w:t xml:space="preserve">Excellent (4): Clearly and accurately explains how bond type and structure determine at least four physical properties (melting point, electrical conductivity, solubility, and hardness or malleability) using particle-level reasoning. Comparisons between substances (e.g., graphite vs. diamond; NaCl vs. wax) are used effectively to show how structural differences produce property differences. Evidence from experiments in Lessons 3–7 is explicitly cited.</w:t>
             </w:r>
           </w:p>
         </w:tc>
@@ -1744,7 +1706,7 @@
                 <w:sz w:val="18"/>
                 <w:szCs w:val="18"/>
               </w:rPr>
-              <w:t xml:space="preserve">Proficient (3): Links most bond types to physical properties with generally accurate causal reasoning. References at least one observation from practical investigations. One or two property–bond links may lack mechanistic explanation but are factually correct.</w:t>
+              <w:t xml:space="preserve">Proficient (3): Explains how bond type and structure determine at least three physical properties with mostly correct particle-level reasoning. Some comparison between substances is attempted. At least one reference to experimental evidence is included, though it may be vague.</w:t>
             </w:r>
           </w:p>
         </w:tc>
@@ -1776,7 +1738,7 @@
                 <w:sz w:val="18"/>
                 <w:szCs w:val="18"/>
               </w:rPr>
-              <w:t xml:space="preserve">Developing (1-2): Makes some connections between bond types and properties but reasoning is often superficial or incomplete (e.g., states 'ionic compounds have high melting points' without explaining why). Little or no reference to experimental evidence or investigation results.</w:t>
+              <w:t xml:space="preserve">Developing (1-2): Attempts to link bond type to properties but reasoning is largely descriptive rather than explanatory (e.g., 'ionic bonds are strong so ionic substances have high melting points' without particle-level justification). Fewer than three properties are addressed. Little or no reference to experimental evidence.</w:t>
             </w:r>
           </w:p>
         </w:tc>
@@ -1810,7 +1772,7 @@
                 <w:sz w:val="18"/>
                 <w:szCs w:val="18"/>
               </w:rPr>
-              <w:t xml:space="preserve">Use of the Gikomba Phenomenon and Kenyan Contexts</w:t>
+              <w:t xml:space="preserve">Connecting Bond Type and Properties to Real-World Uses</w:t>
             </w:r>
           </w:p>
         </w:tc>
@@ -1842,7 +1804,7 @@
                 <w:sz w:val="18"/>
                 <w:szCs w:val="18"/>
               </w:rPr>
-              <w:t xml:space="preserve">Excellent (4): Explicitly addresses all four Gikomba products (salt, graphite, diamond, copper) in the explanation and provides a clear, complete verdict for each. Includes at least two additional Kenyan real-world examples (e.g., jembe, sufuria, Lake Victoria, fertilisers, candle wax, roofing sheets) that are correctly connected to bond types. Examples are specific and contextually accurate.</w:t>
+              <w:t xml:space="preserve">Excellent (4): Provides at least four specific examples of substances and uses, each with a complete and accurate chain of reasoning (bond type → structure → property → use). At least two examples are clearly drawn from Kenyan everyday life or Kenyan industries, with accurate and specific detail (e.g., naming specific uses such as sufurias, KCSE pencils, mining drills, oral rehydration salts).</w:t>
             </w:r>
           </w:p>
         </w:tc>
@@ -1874,7 +1836,7 @@
                 <w:sz w:val="18"/>
                 <w:szCs w:val="18"/>
               </w:rPr>
-              <w:t xml:space="preserve">Proficient (3): Addresses at least three of the four Gikomba products with correct explanations. Includes at least one additional Kenyan example connected to a bond type. The phenomenon connection is clear but the verdict for one product may be incomplete.</w:t>
+              <w:t xml:space="preserve">Proficient (3): Provides at least three specific examples with mostly complete chains of reasoning. At least one example is drawn from a Kenyan context. The link between property and use is clear, though the link from bond type to structure may be less fully explained in one or two cases.</w:t>
             </w:r>
           </w:p>
         </w:tc>
@@ -1906,7 +1868,7 @@
                 <w:sz w:val="18"/>
                 <w:szCs w:val="18"/>
               </w:rPr>
-              <w:t xml:space="preserve">Developing (1-2): References the Gikomba phenomenon briefly or superficially. Addresses one or two products only, or addresses all four but with significant scientific errors. Additional Kenyan examples are absent or not connected to bonding concepts.</w:t>
+              <w:t xml:space="preserve">Developing (1-2): Provides fewer than three examples, or examples lack a complete reasoning chain (e.g., states a use without explaining which property makes the substance suitable, or which bond type produces that property). Kenyan context is absent or superficial.</w:t>
             </w:r>
           </w:p>
         </w:tc>
@@ -1940,7 +1902,7 @@
                 <w:sz w:val="18"/>
                 <w:szCs w:val="18"/>
               </w:rPr>
-              <w:t xml:space="preserve">Comparison and Contrast of Diamond and Graphite (Carbon Allotropes)</w:t>
+              <w:t xml:space="preserve">Anchoring Phenomenon and Driving Question</w:t>
             </w:r>
           </w:p>
         </w:tc>
@@ -1972,7 +1934,7 @@
                 <w:sz w:val="18"/>
                 <w:szCs w:val="18"/>
               </w:rPr>
-              <w:t xml:space="preserve">Excellent (4): Provides a precise, detailed comparison of diamond and graphite that accurately explains why two substances made entirely of carbon atoms have such different properties. Correctly identifies: four covalent bonds per carbon in diamond versus three in graphite; the tetrahedral 3D lattice of diamond versus the layered hexagonal sheets of graphite; absence of free electrons in diamond versus delocalised electrons between graphite layers; and the role of van der Waals forces between graphite sheets.</w:t>
+              <w:t xml:space="preserve">Excellent (4): Explicitly and accurately returns to the Nairobi student's observations in the anchoring phenomenon to frame or conclude the explanation. Provides a clear, complete, and well-reasoned answer to the driving question that synthesises learning from across the unit. Demonstrates understanding that the bond type → structure → properties → uses chain is a transferable principle by applying it to at least one new or unfamiliar example.</w:t>
             </w:r>
           </w:p>
         </w:tc>
@@ -2004,7 +1966,7 @@
                 <w:sz w:val="18"/>
                 <w:szCs w:val="18"/>
               </w:rPr>
-              <w:t xml:space="preserve">Proficient (3): Correctly compares diamond and graphite and identifies the key structural difference (3 vs. 4 bonds per carbon). Explains why graphite conducts electricity and diamond does not, and why graphite is soft while diamond is hard. May not mention van der Waals forces between graphite layers or may omit the role of delocalised electrons.</w:t>
+              <w:t xml:space="preserve">Proficient (3): References the anchoring phenomenon and addresses the driving question, but the connection may be stated rather than fully reasoned. Synthesises learning from most of the unit. Applies the bonding principle to familiar examples but does not clearly extend to a new or unfamiliar substance.</w:t>
             </w:r>
           </w:p>
         </w:tc>
@@ -2036,7 +1998,7 @@
                 <w:sz w:val="18"/>
                 <w:szCs w:val="18"/>
               </w:rPr>
-              <w:t xml:space="preserve">Developing (1-2): Identifies that diamond and graphite are both forms of carbon but provides an incomplete or partially incorrect structural explanation. May state only that 'diamond is harder' without explaining the bonding reason, or may confuse which allotrope conducts electricity.</w:t>
+              <w:t xml:space="preserve">Developing (1-2): Makes limited or no reference to the anchoring phenomenon. The driving question is addressed only partially or in a superficial way. The explanation reads as a list of facts about individual substances rather than a synthesis of a unifying principle.</w:t>
             </w:r>
           </w:p>
         </w:tc>
@@ -2070,7 +2032,7 @@
                 <w:sz w:val="18"/>
                 <w:szCs w:val="18"/>
               </w:rPr>
-              <w:t xml:space="preserve">Scientific Communication, Structure, and Real-World Reflection</w:t>
+              <w:t xml:space="preserve">Use of Scientific Evidence and Quality of Scientific Communication</w:t>
             </w:r>
           </w:p>
         </w:tc>
@@ -2102,7 +2064,7 @@
                 <w:sz w:val="18"/>
                 <w:szCs w:val="18"/>
               </w:rPr>
-              <w:t xml:space="preserve">Excellent (4): Response is well organised into clearly distinct sections that build logically from the phenomenon to the verdict. Writing is fluent, precise, and uses scientific language consistently and correctly. Final reflection paragraph makes a specific, well-reasoned argument about the importance of chemical bonding for Kenya, referencing at least one real Kenyan industry, institution, or research context. Response meets or exceeds the 300-word minimum with no significant irrelevant content.</w:t>
+              <w:t xml:space="preserve">Excellent (4): All claims are supported by specific evidence from experiments, observations, or models completed during the unit. The explanation is logically organised, exceeds 300 words, and uses precise scientific vocabulary throughout. Writing is clear, accurate, and demonstrates independent reasoning rather than reproduction of textbook statements.</w:t>
             </w:r>
           </w:p>
         </w:tc>
@@ -2134,7 +2096,7 @@
                 <w:sz w:val="18"/>
                 <w:szCs w:val="18"/>
               </w:rPr>
-              <w:t xml:space="preserve">Proficient (3): Response is organised and generally easy to follow. Scientific language is mostly correct with occasional informal or imprecise phrasing. Final reflection is present and references Kenya but may be general rather than specific. Response meets the 300-word minimum.</w:t>
+              <w:t xml:space="preserve">Proficient (3): Most claims are supported by evidence, with at least two specific references to experimental observations or model-building activities. The explanation meets the 300-word minimum, is mostly logically organised, and uses scientific vocabulary with reasonable accuracy. Occasional reliance on textbook-style phrasing.</w:t>
             </w:r>
           </w:p>
         </w:tc>
@@ -2166,7 +2128,7 @@
                 <w:sz w:val="18"/>
                 <w:szCs w:val="18"/>
               </w:rPr>
-              <w:t xml:space="preserve">Developing (1-2): Response lacks clear organisation or logical flow between sections. Scientific language is frequently informal, vague, or incorrect. Final reflection is absent, very brief, or does not connect to chemical bonding. Response may fall below the 300-word minimum or contain significant off-topic content.</w:t>
+              <w:t xml:space="preserve">Developing (1-2): Few or no claims are supported by specific evidence. The explanation may be below 300 words, poorly organised, or consist primarily of definitions and textbook statements without original reasoning. Scientific vocabulary is limited or used inaccurately.</w:t>
             </w:r>
           </w:p>
         </w:tc>

</xml_diff>

<commit_message>
Generator: schema-validate tool output + retry on off-schema (array-as-string); prompt fix
</commit_message>
<xml_diff>
--- a/data/outputs/docx/Grade 10 Chemistry/Chemistry 1.4/Chemistry_Chemical_Bonding_FinalExplanation.docx
+++ b/data/outputs/docx/Grade 10 Chemistry/Chemistry 1.4/Chemistry_Chemical_Bonding_FinalExplanation.docx
@@ -422,7 +422,7 @@
                 <w:sz w:val="18"/>
                 <w:szCs w:val="18"/>
               </w:rPr>
-              <w:t xml:space="preserve">This is your Final Explanation task for Sub-Strand 1.4: Chemical Bonding. You have completed eight lessons investigating why sodium chloride, graphite, aluminium, and diamond behave so differently despite all being made of atoms held together by chemical bonds. Now it is time to bring all of your evidence and understanding together into one coherent, well-organised written explanation. Use your Summary Table from Lesson 7, your experimental observations from Lessons 3–7, and your final revised model from Lesson 8 to support every claim you make. Your explanation must directly address the driving question: 'How do the types of chemical bonds between atoms determine the structure, properties, and uses of the substances all around us?' You must connect your answer back to the anchoring phenomenon — the Form 4 student in Nairobi who noticed that salt, graphite, aluminium, and diamond all behave in puzzling and contrasting ways. Include specific Kenyan examples and real-world uses wherever possible (for example, NaCl in cooking ugali and githeri, aluminium in sufurias and matatu body panels, graphite in pencils used in KCSE exams, or industrial diamond used in mining drills in the Rift Valley). Your explanation must be a minimum of 300 words, written in clear scientific English, and must cover all four sections below. Use evidence from your experiments and observations — not just definitions — to justify your conclusions.</w:t>
+              <w:t xml:space="preserve">You have now completed all eight lessons in the Chemical Bonding unit. In this Final Explanation assessment, you will demonstrate how well you can use the scientific ideas you have built — across ionic bonding, covalent bonding, metallic bonding, giant covalent structures, and intermolecular forces — to fully explain the anchoring phenomenon: why table salt dissolves in the mama's pot of boiling water, why graphite in a pencil writes smoothly and conducts electricity, and why the jeweller's diamond-tipped blade on River Road never scratches, melts, or dissolves. Use your completed Summary Table from Lesson 7, your annotated model from the Model Building Project (Lesson 8), your Lewis diagrams and investigation results from Lessons 2–6, and any notes from your Driving Question Board (DQB) to support your answers. Your response must be written in continuous, well-organised prose — not bullet points. Each section has a specific prompt; read it carefully before writing. You must connect every explanation back to evidence (observations, experimental results, or data) gathered during the unit. Include at least TWO specific Kenyan examples, contexts, or applications in your response beyond those already named in the prompts. Your total response across all sections must be a minimum of 300 words. Write clearly and precisely: a fellow Grade 10 student who missed the unit should be able to read your work and understand why chemical bonds determine what a substance can do.</w:t>
             </w:r>
           </w:p>
         </w:tc>
@@ -483,7 +483,7 @@
                 <w:sz w:val="22"/>
                 <w:szCs w:val="22"/>
               </w:rPr>
-              <w:t xml:space="preserve">SECTION 1: EXPLAINING THE ANCHORING PHENOMENON</w:t>
+              <w:t xml:space="preserve">SECTION 1: EXPLAINING THE ANCHORING PHENOMENON — SALT, GRAPHITE, AND DIAMOND</w:t>
             </w:r>
           </w:p>
         </w:tc>
@@ -517,7 +517,7 @@
                 <w:sz w:val="18"/>
                 <w:szCs w:val="18"/>
               </w:rPr>
-              <w:t xml:space="preserve">Return to the original phenomenon. Explain why the Form 4 student in Nairobi observed such dramatic differences between sodium chloride, graphite, aluminium, and diamond. In your answer, identify the type of chemical bond present in each substance, describe the large-scale structure each bond type produces, and connect these structures to at least three contrasting properties the student observed (for example: solubility, electrical conductivity, hardness, melting point, malleability). Use specific evidence from your experiments or observations in Lesson 7 to support your claims.</w:t>
+              <w:t xml:space="preserve">Return to the anchoring phenomenon introduced in Lesson 1. Explain, using the correct bond types and structures for each substance, why table salt (NaCl) dissolves rapidly in the mama's boiling water, why graphite slides smoothly across paper and conducts electricity, and why the jeweller's diamond blade on Nairobi's River Road can cut hard rock without breaking or dissolving. Your explanation must name the specific bond type in each substance, describe the structural arrangement of those bonds, and link the structure directly to the observed behaviour. Do not simply list facts — tell the story of what is happening at the atomic and molecular level in each case.</w:t>
             </w:r>
           </w:p>
         </w:tc>
@@ -549,7 +549,7 @@
                 <w:sz w:val="18"/>
                 <w:szCs w:val="18"/>
               </w:rPr>
-              <w:t xml:space="preserve">When the Form 4 student in Nairobi was helping prepare supper, she was unknowingly surrounded by four completely different types of bonding and structure. The table salt (sodium chloride) she dissolved in water contains ionic bonds — electrostatic forces of attraction between positively charged sodium ions (Na⁺) and negatively charged chloride ions (Cl⁻), arranged in a giant ionic lattice. Because this lattice is held together by strong electrostatic forces in all directions, NaCl has a high melting point, but when placed in water, the polar water molecules are able to pull the ions apart from the surface of the lattice, so it dissolves readily. Once dissolved, the free-moving ions carry electrical charge, which is why the solution conducts electricity. In our Lesson 7 experiment, we confirmed that solid NaCl did not conduct electricity but its aqueous solution did — exactly matching this explanation.</w:t>
+              <w:t xml:space="preserve">The three substances in the phenomenon — table salt, graphite, and diamond — behave so differently because they are held together by entirely different types of chemical bonds arranged in entirely different three-dimensional structures, and it is those invisible atomic-scale differences that produce the dramatic visible differences the mama and the jeweller observe every day.</w:t>
             </w:r>
           </w:p>
           <w:p>
@@ -587,7 +587,45 @@
                 <w:sz w:val="18"/>
                 <w:szCs w:val="18"/>
               </w:rPr>
-              <w:t xml:space="preserve">The graphite in the student's pencil and the diamond she recalled from her class trip are both made entirely of carbon atoms, yet they behave in opposite ways because their bonding structures are completely different. Graphite has a giant covalent layered structure: each carbon atom forms three strong covalent bonds with neighbouring carbon atoms in flat hexagonal layers. The fourth valence electron on each carbon atom is delocalised across the entire layer, forming a 'sea' of mobile electrons — this is why graphite conducts electricity, just like a metal. The layers are held together only by weak van der Waals forces, so they slide over each other easily, making graphite slippery and soft enough to leave marks on paper. Diamond, by contrast, has a giant covalent network structure in which every carbon atom forms four strong covalent bonds in a rigid three-dimensional tetrahedral arrangement. There are no free electrons and no weak interlayer forces, so diamond does not conduct electricity and is exceptionally hard — the hardest natural substance known. The aluminium sufuria conducts heat and electricity and can be beaten into shape because aluminium has metallic bonding: a lattice of positive aluminium ions (Al³⁺) surrounded by a 'sea' of delocalised electrons. These mobile electrons carry both heat and electrical current, while the non-directional nature of metallic bonds allows layers of ions to slide without breaking, making aluminium malleable.</w:t>
+              <w:t xml:space="preserve">Table salt (NaCl) is an ionic compound formed when sodium transfers one electron to chlorine, producing Na⁺ and Cl⁻ ions. These oppositely charged ions arrange themselves into a giant ionic lattice — a vast, orderly three-dimensional grid held together by strong electrostatic attraction between the ions. When the mama drops salt into boiling water, the polar water molecules are attracted to the surface ions of the lattice: the slightly negative oxygen end of each water molecule pulls at Na⁺ ions, and the slightly positive hydrogen ends pull at Cl⁻ ions. These ion–dipole attractions are strong enough to overcome the ionic lattice energy, so the lattice breaks apart ion by ion and the salt disappears into solution. This is why, within seconds, the ugali-cooking water becomes salty throughout — the ions disperse freely.</w:t>
+            </w:r>
+          </w:p>
+          <w:p>
+            <w:pPr>
+              <w:spacing w:after="40" w:before="0"/>
+              <w:jc w:val="left"/>
+            </w:pPr>
+            <w:r>
+              <w:rPr>
+                <w:rFonts w:ascii="Arial" w:cs="Arial" w:eastAsia="Arial" w:hAnsi="Arial"/>
+                <w:b w:val="false"/>
+                <w:bCs w:val="false"/>
+                <w:i w:val="false"/>
+                <w:iCs w:val="false"/>
+                <w:color w:val="000000"/>
+                <w:sz w:val="18"/>
+                <w:szCs w:val="18"/>
+              </w:rPr>
+              <w:t xml:space="preserve"/>
+            </w:r>
+          </w:p>
+          <w:p>
+            <w:pPr>
+              <w:spacing w:after="40" w:before="0"/>
+              <w:jc w:val="left"/>
+            </w:pPr>
+            <w:r>
+              <w:rPr>
+                <w:rFonts w:ascii="Arial" w:cs="Arial" w:eastAsia="Arial" w:hAnsi="Arial"/>
+                <w:b w:val="false"/>
+                <w:bCs w:val="false"/>
+                <w:i w:val="false"/>
+                <w:iCs w:val="false"/>
+                <w:color w:val="000000"/>
+                <w:sz w:val="18"/>
+                <w:szCs w:val="18"/>
+              </w:rPr>
+              <w:t xml:space="preserve">Graphite is a giant covalent structure made entirely of carbon atoms, but its carbon atoms form only three covalent bonds each, leaving one delocalised electron per carbon atom free to move across the entire layer. The atoms are arranged in flat hexagonal rings that stack in parallel layers. The layers are held to each other only by weak van der Waals (London dispersion) forces, so they slide over one another easily — exactly what happens when the student presses pencil to paper: layers of graphite shear off and remain on the page as a mark. The delocalised electrons allow graphite to conduct electricity, which is why it is used in electrodes in Kenyan industrial electrolysis plants. Diamond, also pure carbon, has each carbon atom forming four strong covalent bonds in a tetrahedral arrangement that extends in all three dimensions, creating an interlocking giant covalent lattice with no weak planes and no free electrons. Every bond must be broken to deform or dissolve the structure, which requires an enormous input of energy — far more than boiling water or mechanical pressure can supply. This is why the jeweller's blade cuts rock rather than being cut by it, and why diamond neither dissolves nor conducts electricity.</w:t>
             </w:r>
           </w:p>
         </w:tc>
@@ -648,7 +686,7 @@
                 <w:sz w:val="22"/>
                 <w:szCs w:val="22"/>
               </w:rPr>
-              <w:t xml:space="preserve">SECTION 2: THE FOUR TYPES OF CHEMICAL BONDS AND THEIR STRUCTURES</w:t>
+              <w:t xml:space="preserve">SECTION 2: BOND TYPES, STRUCTURES, AND PHYSICAL PROPERTIES</w:t>
             </w:r>
           </w:p>
         </w:tc>
@@ -682,7 +720,7 @@
                 <w:sz w:val="18"/>
                 <w:szCs w:val="18"/>
               </w:rPr>
-              <w:t xml:space="preserve">Explain the four main types of chemical bonding covered in this unit: ionic bonding, covalent bonding (including dative covalent bonding), metallic bonding, and intermolecular forces (hydrogen bonds and van der Waals forces). For each bond type, describe how the bond forms at the atomic level, what large-scale structure results, and give at least one specific Kenyan or everyday example of a substance that has that bond type. Ensure you explain the difference between giant structures and simple molecular structures for covalent substances.</w:t>
+              <w:t xml:space="preserve">Using specific examples from at least THREE different bond types studied in this unit (ionic, simple molecular covalent, metallic, giant covalent, or bonds involving dative covalent, hydrogen bonds, or van der Waals forces), explain how the type of bond and the resulting structure determine three physical properties: melting point, electrical conductivity, and solubility in water. For each bond type you choose, state a specific substance as your example, describe its structure, and explain the property in terms of what must happen at the particle level for that property to be observed. You may draw on substances discussed in class or on additional Kenyan-life examples such as metals used in Jua Kali workshops, water from Lake Victoria, or cooking gas (LPG).</w:t>
             </w:r>
           </w:p>
         </w:tc>
@@ -714,7 +752,7 @@
                 <w:sz w:val="18"/>
                 <w:szCs w:val="18"/>
               </w:rPr>
-              <w:t xml:space="preserve">Ionic bonding occurs when one or more electrons are completely transferred from a metal atom to a non-metal atom. The metal atom loses electrons to become a positively charged cation, and the non-metal atom gains electrons to become a negatively charged anion. The opposite charges attract each other by strong electrostatic forces in all directions, building up a giant ionic lattice. Sodium chloride — the salt we add to water when boiling githeri — is the classic example: sodium transfers one electron to chlorine, forming Na⁺ and Cl⁻ ions arranged in a face-centred cubic lattice. The strength of this lattice gives NaCl a high melting point (801 °C) and makes it a crystalline solid at room temperature.</w:t>
+              <w:t xml:space="preserve">Chemical bond type and structural arrangement are the two master variables that control every bulk physical property we can measure or observe. Three properties — melting point, electrical conductivity, and solubility in water — each tell a different story about what is happening between particles.</w:t>
             </w:r>
           </w:p>
           <w:p>
@@ -752,7 +790,83 @@
                 <w:sz w:val="18"/>
                 <w:szCs w:val="18"/>
               </w:rPr>
-              <w:t xml:space="preserve">Covalent bonding forms when two non-metal atoms share pairs of electrons so that each atom achieves a full outer shell. A simple covalent molecule like water (H₂O) — which Kenyans boil every day to make tea in Kericho or uji in Kisumu — consists of small, discrete molecules. The covalent bonds within each molecule are strong, but the intermolecular forces between molecules (van der Waals forces and, in water's case, hydrogen bonds) are relatively weak, giving simple covalent substances low melting and boiling points. A dative covalent bond is a special case where both electrons in the shared pair come from the same atom, as seen in the ammonium ion (NH₄⁺). Giant covalent structures, such as diamond and graphite, also involve covalent bonding but extend continuously in two or three dimensions, producing substances with very high melting points. Metallic bonding, found in aluminium, copper, and iron, consists of a regular lattice of positive metal ions held together by a delocalised sea of electrons. Intermolecular forces — including van der Waals forces and hydrogen bonds — act between molecules rather than within them and explain why substances like candle wax (used in many Kenyan homes during power cuts) melt at low temperatures, while water has an unusually high boiling point for its small molecular size.</w:t>
+              <w:t xml:space="preserve">Melting point is determined by how much energy is needed to overcome the forces holding the structure together. In sodium chloride (ionic bonding, giant ionic lattice), the electrostatic forces between Na⁺ and Cl⁻ ions are very strong and act in all directions, so the melting point is high (801 °C). By contrast, water (H₂O) is a simple molecular covalent substance: the O–H covalent bonds within each molecule are strong, but the molecules are held to each other only by hydrogen bonds, which are much weaker than ionic or covalent bonds. Liquid water therefore exists at the temperatures found in Kenyan kitchens (around 100 °C at sea level in Nairobi), and ice melts easily on a warm day at the coast in Mombasa. Metals such as iron, used in Jua Kali workshops across Nairobi's Kamukunji district, have high melting points because the metallic bond — the electrostatic attraction between a lattice of positive metal ions and a 'sea' of delocalised electrons — is strong and non-directional, requiring substantial energy to disrupt.</w:t>
+            </w:r>
+          </w:p>
+          <w:p>
+            <w:pPr>
+              <w:spacing w:after="40" w:before="0"/>
+              <w:jc w:val="left"/>
+            </w:pPr>
+            <w:r>
+              <w:rPr>
+                <w:rFonts w:ascii="Arial" w:cs="Arial" w:eastAsia="Arial" w:hAnsi="Arial"/>
+                <w:b w:val="false"/>
+                <w:bCs w:val="false"/>
+                <w:i w:val="false"/>
+                <w:iCs w:val="false"/>
+                <w:color w:val="000000"/>
+                <w:sz w:val="18"/>
+                <w:szCs w:val="18"/>
+              </w:rPr>
+              <w:t xml:space="preserve"/>
+            </w:r>
+          </w:p>
+          <w:p>
+            <w:pPr>
+              <w:spacing w:after="40" w:before="0"/>
+              <w:jc w:val="left"/>
+            </w:pPr>
+            <w:r>
+              <w:rPr>
+                <w:rFonts w:ascii="Arial" w:cs="Arial" w:eastAsia="Arial" w:hAnsi="Arial"/>
+                <w:b w:val="false"/>
+                <w:bCs w:val="false"/>
+                <w:i w:val="false"/>
+                <w:iCs w:val="false"/>
+                <w:color w:val="000000"/>
+                <w:sz w:val="18"/>
+                <w:szCs w:val="18"/>
+              </w:rPr>
+              <w:t xml:space="preserve">Electrical conductivity depends on the availability of charged particles that can move freely. Metals conduct in all states because delocalised electrons flow through the lattice when a voltage is applied — this is why copper wire carries electricity to homes across the Rift Valley. Ionic compounds such as NaCl conduct only when molten or dissolved in water, because only then are the ions free to move; in the solid lattice the ions are fixed in place and cannot carry charge. Simple molecular substances like cooking gas (propane, C₃H₈) do not conduct in any state because they have neither free electrons nor ions — all electrons are localised within covalent bonds inside each molecule.</w:t>
+            </w:r>
+          </w:p>
+          <w:p>
+            <w:pPr>
+              <w:spacing w:after="40" w:before="0"/>
+              <w:jc w:val="left"/>
+            </w:pPr>
+            <w:r>
+              <w:rPr>
+                <w:rFonts w:ascii="Arial" w:cs="Arial" w:eastAsia="Arial" w:hAnsi="Arial"/>
+                <w:b w:val="false"/>
+                <w:bCs w:val="false"/>
+                <w:i w:val="false"/>
+                <w:iCs w:val="false"/>
+                <w:color w:val="000000"/>
+                <w:sz w:val="18"/>
+                <w:szCs w:val="18"/>
+              </w:rPr>
+              <w:t xml:space="preserve"/>
+            </w:r>
+          </w:p>
+          <w:p>
+            <w:pPr>
+              <w:spacing w:after="40" w:before="0"/>
+              <w:jc w:val="left"/>
+            </w:pPr>
+            <w:r>
+              <w:rPr>
+                <w:rFonts w:ascii="Arial" w:cs="Arial" w:eastAsia="Arial" w:hAnsi="Arial"/>
+                <w:b w:val="false"/>
+                <w:bCs w:val="false"/>
+                <w:i w:val="false"/>
+                <w:iCs w:val="false"/>
+                <w:color w:val="000000"/>
+                <w:sz w:val="18"/>
+                <w:szCs w:val="18"/>
+              </w:rPr>
+              <w:t xml:space="preserve">Solubility in water follows the principle 'like dissolves like.' Ionic compounds dissolve because polar water molecules can stabilise the separated ions through ion–dipole interactions. Simple polar molecules such as ethanol (used in Kenyan medical laboratories) dissolve because they form hydrogen bonds with water. Non-polar substances such as cooking oil (used to fry mandazi) do not dissolve in water because water molecules have stronger attractions for each other (hydrogen bonds) than for the non-polar oil molecules, so the oil molecules are excluded — which is why the mama sees the oil float on top of the water rather than mixing in.</w:t>
             </w:r>
           </w:p>
         </w:tc>
@@ -813,7 +927,7 @@
                 <w:sz w:val="22"/>
                 <w:szCs w:val="22"/>
               </w:rPr>
-              <w:t xml:space="preserve">SECTION 3: BOND TYPE, STRUCTURE, AND PHYSICAL PROPERTIES</w:t>
+              <w:t xml:space="preserve">SECTION 3: LEWIS DIAGRAMS AND THE DATIVE COVALENT BOND</w:t>
             </w:r>
           </w:p>
         </w:tc>
@@ -847,7 +961,7 @@
                 <w:sz w:val="18"/>
                 <w:szCs w:val="18"/>
               </w:rPr>
-              <w:t xml:space="preserve">Explain how the type of chemical bond and the resulting structure directly determine the physical properties of a substance. Your explanation must address at least four properties: melting point, electrical conductivity, solubility in water, and either hardness or malleability. For each property, explain the particle-level reason why different bond types produce different behaviour. Use data or observations from your experiments in Lessons 3–7 as evidence. Where possible, compare two or more substances to show how differences in bonding lead to differences in properties.</w:t>
+              <w:t xml:space="preserve">Choose ONE molecule that contains a dative (coordinate) covalent bond studied in this unit (for example: the ammonium ion NH₄⁺, the hydronium ion H₃O⁺, or carbon monoxide CO). Describe in words — as if explaining to a classmate who was absent — what a dative covalent bond is, how it forms in your chosen molecule, and how it is the same as and different from an ordinary covalent bond once it has formed. Then explain why understanding dative bonds matters for a real-world Kenyan application (for example: nitrogen fertiliser chemistry important to Kenyan maize farmers in the Rift Valley, or the chemistry of haemoglobin carrying oxygen in the blood of Kenyan marathon runners from Iten).</w:t>
             </w:r>
           </w:p>
         </w:tc>
@@ -879,7 +993,7 @@
                 <w:sz w:val="18"/>
                 <w:szCs w:val="18"/>
               </w:rPr>
-              <w:t xml:space="preserve">The physical properties of any substance are determined by two things working together: the type of bond present and the large-scale structure those bonds produce. Melting point is a good starting point. To melt a solid, you must supply enough energy to overcome the forces holding its particles together. In a giant ionic lattice like NaCl, the electrostatic attractions between ions in all directions are strong, so a large amount of energy is needed — NaCl melts at 801 °C. In a giant covalent structure like diamond, you must break strong covalent bonds throughout the entire three-dimensional network, requiring even more energy (diamond melts above 3 500 °C). By contrast, a simple covalent molecule like candle wax only requires energy to overcome weak van der Waals forces between molecules — the covalent bonds inside each molecule are not broken during melting — so wax melts at a low temperature, well below 100 °C. In our Lesson 7 investigation, we observed that substances with giant structures (ionic or covalent) had significantly higher melting points than simple molecular substances, which matched this particle-level reasoning.</w:t>
+              <w:t xml:space="preserve">A dative covalent bond — also called a coordinate bond — is a special type of covalent bond in which both electrons in the shared pair are donated by only one of the two atoms involved. In an ordinary covalent bond, each atom contributes one electron to the shared pair; in a dative bond, one atom (the donor) has a lone pair of electrons and donates both electrons to an atom or ion (the acceptor) that has an empty orbital available to receive them. Once the bond has formed, however, it is chemically identical to any other covalent bond — it has the same bond length and bond strength as an ordinary covalent bond between the same two atoms. The distinction is only in how the bond was formed, not in what it looks like once it exists.</w:t>
             </w:r>
           </w:p>
           <w:p>
@@ -917,7 +1031,45 @@
                 <w:sz w:val="18"/>
                 <w:szCs w:val="18"/>
               </w:rPr>
-              <w:t xml:space="preserve">Electrical conductivity depends on whether a substance contains charged particles that are free to move. In solid NaCl, the ions are fixed in the lattice and cannot move, so it does not conduct electricity — we confirmed this with the conductivity apparatus in our experiment. When NaCl is dissolved in water or melted, the ions become free to move and carry current. Metallic substances like the aluminium sufuria conduct electricity in the solid state because the delocalised electrons are always free to flow. Graphite is unusual among covalent substances because its delocalised electrons within each layer allow it to conduct electricity, unlike diamond where all electrons are localised in covalent bonds. Solubility follows the principle 'like dissolves like': ionic compounds such as NaCl dissolve in polar water because water molecules attract and separate the ions, but giant covalent structures like graphite and diamond do not dissolve because water cannot overcome the strong covalent bonds. Hardness and malleability distinguish giant covalent from metallic structures: diamond is the hardest substance because breaking it requires snapping strong covalent bonds throughout the network, whereas aluminium is malleable because the non-directional sea of electrons allows layers of ions to slide past each other without the structure falling apart.</w:t>
+              <w:t xml:space="preserve">The ammonium ion (NH₄⁺) is a clear example. Ammonia (NH₃) has three ordinary N–H covalent bonds and one lone pair on the nitrogen atom. When a hydrogen ion (H⁺, a proton with no electrons) encounters the ammonia molecule, the lone pair on nitrogen donates both its electrons to the empty orbital of H⁺, forming a fourth N–H bond — a dative bond. The result is the tetrahedral NH₄⁺ ion, in which all four N–H bonds are now equivalent; you cannot distinguish the dative bond from the other three by any measurement.</w:t>
+            </w:r>
+          </w:p>
+          <w:p>
+            <w:pPr>
+              <w:spacing w:after="40" w:before="0"/>
+              <w:jc w:val="left"/>
+            </w:pPr>
+            <w:r>
+              <w:rPr>
+                <w:rFonts w:ascii="Arial" w:cs="Arial" w:eastAsia="Arial" w:hAnsi="Arial"/>
+                <w:b w:val="false"/>
+                <w:bCs w:val="false"/>
+                <w:i w:val="false"/>
+                <w:iCs w:val="false"/>
+                <w:color w:val="000000"/>
+                <w:sz w:val="18"/>
+                <w:szCs w:val="18"/>
+              </w:rPr>
+              <w:t xml:space="preserve"/>
+            </w:r>
+          </w:p>
+          <w:p>
+            <w:pPr>
+              <w:spacing w:after="40" w:before="0"/>
+              <w:jc w:val="left"/>
+            </w:pPr>
+            <w:r>
+              <w:rPr>
+                <w:rFonts w:ascii="Arial" w:cs="Arial" w:eastAsia="Arial" w:hAnsi="Arial"/>
+                <w:b w:val="false"/>
+                <w:bCs w:val="false"/>
+                <w:i w:val="false"/>
+                <w:iCs w:val="false"/>
+                <w:color w:val="000000"/>
+                <w:sz w:val="18"/>
+                <w:szCs w:val="18"/>
+              </w:rPr>
+              <w:t xml:space="preserve">Understanding dative bonds is vital for Kenyan maize and bean farmers in the Rift Valley. The industrial production of ammonia via the Haber process, and its subsequent conversion into ammonium nitrate fertiliser (CAN fertiliser), depends on nitrogen chemistry that involves dative bonding. When ammonium salts dissolve in soil water, the NH₄⁺ ions release nitrogen that maize roots can absorb. A farmer in Eldoret who understands why CAN fertiliser must not be mixed with alkaline lime (which would reverse the dative-bond chemistry and release ammonia gas, wasting expensive nitrogen) is a farmer who can protect their harvest and their investment.</w:t>
             </w:r>
           </w:p>
         </w:tc>
@@ -978,7 +1130,7 @@
                 <w:sz w:val="22"/>
                 <w:szCs w:val="22"/>
               </w:rPr>
-              <w:t xml:space="preserve">SECTION 4: BOND TYPE, STRUCTURE, AND THE USES OF SUBSTANCES IN KENYA AND BEYOND</w:t>
+              <w:t xml:space="preserve">SECTION 4: METALLIC BONDING AND ITS APPLICATIONS IN KENYAN LIFE</w:t>
             </w:r>
           </w:p>
         </w:tc>
@@ -1012,7 +1164,7 @@
                 <w:sz w:val="18"/>
                 <w:szCs w:val="18"/>
               </w:rPr>
-              <w:t xml:space="preserve">Explain how the properties arising from each bond type make specific substances suited to particular uses. Give at least four specific examples of substances and their uses, and for each one explain the chain of reasoning: bond type → structure → property → use. At least two of your examples must be drawn from Kenyan everyday life or Kenyan industries (for example: cooking, construction, agriculture, mining, healthcare, or school materials). You should also address the key inquiry question: How do the uses of a substance relate to its bond type and resultant structure?</w:t>
+              <w:t xml:space="preserve">Explain the metallic bond model (the 'sea of electrons') and use it to account for at least THREE characteristic properties of metals: electrical conductivity, malleability/ductility, and high melting point. Then connect these properties to at least TWO specific applications of metals in Kenyan everyday life or industry — for example, in Jua Kali metalwork, Kenyan railway construction (SGR), roofing iron sheets, electrical wiring for rural electrification projects, or any other genuine Kenyan context you are aware of. Your explanation must clearly show that you understand why the sea-of-electrons model, and not any other bond model, accounts for these specific properties.</w:t>
             </w:r>
           </w:p>
         </w:tc>
@@ -1044,7 +1196,7 @@
                 <w:sz w:val="18"/>
                 <w:szCs w:val="18"/>
               </w:rPr>
-              <w:t xml:space="preserve">Understanding why a substance is used for a particular purpose requires following a clear chain of reasoning from bond type to structure to property to use. Aluminium is perhaps the most visible example in everyday Kenyan life. Aluminium has metallic bonding — a lattice of Al³⁺ ions surrounded by a sea of delocalised electrons. This structure makes aluminium an excellent conductor of heat (the delocalised electrons transfer kinetic energy rapidly) and mechanically malleable (the ion layers can slide). As a result, aluminium is ideal for making sufurias and cooking pots used in homes across Nairobi, Kisumu, and Mombasa: it heats food quickly and evenly, can be beaten or pressed into curved shapes without cracking, and is lightweight enough to handle easily. Aluminium is also used in matatu and bus body panels along Kenyan highways for the same reasons: it can be shaped into complex curved forms and does not corrode rapidly.</w:t>
+              <w:t xml:space="preserve">Metals are giant structures in which positive metal ions (the kernels left after valence electrons are released) are arranged in a close-packed lattice, surrounded by and immersed in a 'sea' of delocalised electrons that are free to move throughout the entire structure. These delocalised electrons do not belong to any individual ion — they are shared across the whole metallic lattice. The strong electrostatic attraction between the positive ion cores and the negative sea of electrons is the metallic bond, and it is this bond that explains every distinctive property metals display.</w:t>
             </w:r>
           </w:p>
           <w:p>
@@ -1082,7 +1234,83 @@
                 <w:sz w:val="18"/>
                 <w:szCs w:val="18"/>
               </w:rPr>
-              <w:t xml:space="preserve">Sodium chloride has ionic bonding and a giant ionic lattice. This gives it a high melting point, crystalline structure, and — critically — the ability to dissolve in water and preserve food by drawing moisture out of bacterial cells through osmosis. For centuries, salt has been used across Kenya to preserve nyama choma, fish from Lake Victoria, and vegetables. When dissolved, its ions also make it useful as an electrolyte in oral rehydration solutions used in Kenyan health centres. Graphite's giant covalent layered structure, with delocalised electrons within layers and weak van der Waals forces between them, makes it ideal for pencils used by Kenyan students sitting KCSE examinations: the layers slide off onto paper easily, leaving a visible mark. The same conductivity property makes graphite useful as electrodes in industrial electrolysis. Diamond's giant three-dimensional covalent network gives it unmatched hardness, making industrial-grade diamond the material of choice for drill tips used in mining and geological exploration in Kenya's Rift Valley region, where hard rock must be bored through efficiently. These examples confirm the answer to our key inquiry question: every practical use of a substance can be traced directly back to the type of bond it contains and the structure that bond produces.</w:t>
+              <w:t xml:space="preserve">Electrical conductivity in metals is high because the delocalised electrons can drift freely through the lattice in response to a potential difference (voltage). No ions need to move — only the electrons do. This is why copper wires carry electricity efficiently from hydroelectric plants at Kindaruma Dam along the Tana River to homes hundreds of kilometres away: the electrons simply flow through the continuous sea without needing the heavy copper ions to move at all. No other bond type provides this mobile electron sea in the solid state, which is why ionic and covalent solids do not conduct electricity.</w:t>
+            </w:r>
+          </w:p>
+          <w:p>
+            <w:pPr>
+              <w:spacing w:after="40" w:before="0"/>
+              <w:jc w:val="left"/>
+            </w:pPr>
+            <w:r>
+              <w:rPr>
+                <w:rFonts w:ascii="Arial" w:cs="Arial" w:eastAsia="Arial" w:hAnsi="Arial"/>
+                <w:b w:val="false"/>
+                <w:bCs w:val="false"/>
+                <w:i w:val="false"/>
+                <w:iCs w:val="false"/>
+                <w:color w:val="000000"/>
+                <w:sz w:val="18"/>
+                <w:szCs w:val="18"/>
+              </w:rPr>
+              <w:t xml:space="preserve"/>
+            </w:r>
+          </w:p>
+          <w:p>
+            <w:pPr>
+              <w:spacing w:after="40" w:before="0"/>
+              <w:jc w:val="left"/>
+            </w:pPr>
+            <w:r>
+              <w:rPr>
+                <w:rFonts w:ascii="Arial" w:cs="Arial" w:eastAsia="Arial" w:hAnsi="Arial"/>
+                <w:b w:val="false"/>
+                <w:bCs w:val="false"/>
+                <w:i w:val="false"/>
+                <w:iCs w:val="false"/>
+                <w:color w:val="000000"/>
+                <w:sz w:val="18"/>
+                <w:szCs w:val="18"/>
+              </w:rPr>
+              <w:t xml:space="preserve">Malleability and ductility arise because the metallic bond is non-directional. When a force is applied to a metal — when a Jua Kali artisan in Kamukunji hammers a piece of iron sheet into a sufuria (cooking pot) — the layers of positive ions can slide past one another without breaking the bond, because the sea of electrons simply flows with them and continues to hold the new arrangement together. In an ionic crystal, such sliding would bring like charges next to like charges and shatter the lattice; in a metal, it does not matter where the ions end up — the electron sea always holds.</w:t>
+            </w:r>
+          </w:p>
+          <w:p>
+            <w:pPr>
+              <w:spacing w:after="40" w:before="0"/>
+              <w:jc w:val="left"/>
+            </w:pPr>
+            <w:r>
+              <w:rPr>
+                <w:rFonts w:ascii="Arial" w:cs="Arial" w:eastAsia="Arial" w:hAnsi="Arial"/>
+                <w:b w:val="false"/>
+                <w:bCs w:val="false"/>
+                <w:i w:val="false"/>
+                <w:iCs w:val="false"/>
+                <w:color w:val="000000"/>
+                <w:sz w:val="18"/>
+                <w:szCs w:val="18"/>
+              </w:rPr>
+              <w:t xml:space="preserve"/>
+            </w:r>
+          </w:p>
+          <w:p>
+            <w:pPr>
+              <w:spacing w:after="40" w:before="0"/>
+              <w:jc w:val="left"/>
+            </w:pPr>
+            <w:r>
+              <w:rPr>
+                <w:rFonts w:ascii="Arial" w:cs="Arial" w:eastAsia="Arial" w:hAnsi="Arial"/>
+                <w:b w:val="false"/>
+                <w:bCs w:val="false"/>
+                <w:i w:val="false"/>
+                <w:iCs w:val="false"/>
+                <w:color w:val="000000"/>
+                <w:sz w:val="18"/>
+                <w:szCs w:val="18"/>
+              </w:rPr>
+              <w:t xml:space="preserve">High melting points reflect the strength of the electrostatic attraction between the dense sea of electrons and the closely packed positive ions. Steel used in the Standard Gauge Railway (SGR) line from Mombasa to Nairobi must withstand enormous mechanical stress and the heat of friction; its high melting point (above 1400 °C) ensures it does not deform under normal operating conditions. Aluminium roofing sheets used in Kenyan homes are chosen because aluminium is malleable enough to be rolled into thin sheets, yet its metallic bonds are strong enough that the sheets resist deformation under the weight of heavy rains during the long rains season.</w:t>
             </w:r>
           </w:p>
         </w:tc>
@@ -1143,7 +1371,7 @@
                 <w:sz w:val="22"/>
                 <w:szCs w:val="22"/>
               </w:rPr>
-              <w:t xml:space="preserve">SECTION 5: ANSWERING THE DRIVING QUESTION</w:t>
+              <w:t xml:space="preserve">SECTION 5: ANSWERING THE DRIVING QUESTION — BONDS DETERMINE BEHAVIOUR</w:t>
             </w:r>
           </w:p>
         </w:tc>
@@ -1177,7 +1405,7 @@
                 <w:sz w:val="18"/>
                 <w:szCs w:val="18"/>
               </w:rPr>
-              <w:t xml:space="preserve">Write a concise but complete answer to the driving question of this unit: 'How do the types of chemical bonds between atoms determine the structure, properties, and uses of the substances all around us?' Your answer should synthesise everything you have learned across all eight lessons. Explain the key principle that links bond type → structure → properties → uses, identify which aspects of this unit most surprised or challenged you, and reflect on how your understanding has changed from Lesson 1 (when you first observed the phenomenon) to now. Your answer must show that you can reason beyond memorised facts to explain new, unfamiliar substances using the principles you have learned.</w:t>
+              <w:t xml:space="preserve">Write a direct, evidence-based answer to the unit's Driving Question: 'How do the chemical bonds holding a substance together determine what that substance can do?' Your answer must: (a) state a clear, general claim that answers the question; (b) support the claim with specific evidence drawn from at least three different substances or experiments studied in this unit; (c) acknowledge one limitation of the models used (for example: where do the models oversimplify or break down?); and (d) reflect on how your thinking changed from Lesson 1 (when you first encountered the phenomenon) to now. Write this section as a coherent scientific argument, not a list.</w:t>
             </w:r>
           </w:p>
         </w:tc>
@@ -1209,7 +1437,7 @@
                 <w:sz w:val="18"/>
                 <w:szCs w:val="18"/>
               </w:rPr>
-              <w:t xml:space="preserve">The driving question of this unit — how do the types of chemical bonds between atoms determine the structure, properties, and uses of substances all around us? — has a clear and powerful answer: the type of bond formed between atoms determines the arrangement of those atoms at the microscopic level (the structure), and it is this structure that controls every property we can observe or measure, which in turn dictates every use humans make of that substance. This chain — bond type → structure → properties → uses — is the central principle of chemical bonding, and it explains everything from why the Nairobi student's salt dissolved in water to why diamond-tipped drills can bore through the hardest rock in the Rift Valley.</w:t>
+              <w:t xml:space="preserve">The central claim of this unit can be stated simply and powerfully: the type of chemical bond present in a substance, and the three-dimensional structure that bond type produces, together determine every observable and measurable property of that substance — what it can dissolve in, how it responds to heat, whether it conducts electricity, and how it behaves under mechanical force. Bond type is not decoration; it is destiny.</w:t>
             </w:r>
           </w:p>
           <w:p>
@@ -1247,7 +1475,7 @@
                 <w:sz w:val="18"/>
                 <w:szCs w:val="18"/>
               </w:rPr>
-              <w:t xml:space="preserve">At the start of Lesson 1, I could observe the differences between salt, graphite, diamond, and aluminium, but I had no framework to explain them. I might have guessed that 'stronger' bonds always meant 'harder' substances, or that all conductors must be metals. By working through all eight lessons, I now understand that the key variable is not just bond strength but bond type and the resulting structure. Two substances can both have strong covalent bonds — graphite and diamond — yet behave in completely opposite ways because one has a layered two-dimensional structure and the other has a three-dimensional network. This surprised me greatly during Lesson 6.</w:t>
+              <w:t xml:space="preserve">The evidence for this claim accumulated across every lesson. Table salt (NaCl) dissolves in the mama's boiling water because ionic bonds create a lattice that polar water molecules can dismantle ion by ion — the bond type (ionic) predicts the behaviour (solubility in polar solvents, high melting point, conductivity when dissolved). Diamond refuses to dissolve, melt at any ordinary temperature, or conduct electricity because four strong directional covalent bonds per carbon atom create a three-dimensional interlocking lattice with no weak points and no free electrons — the bond type (giant covalent, tetrahedral) predicts the behaviour (extreme hardness, very high melting point, non-conductor). Graphite, despite being the same element as diamond, has a completely different bond arrangement — three covalent bonds per carbon in flat layers with delocalised electrons and weak van der Waals forces between layers — and this difference in structure predicts opposite behaviour: slippery, electrically conducting, and easy to cleave into thin sheets. The metallic bonding in the copper wires that carry electricity to Kenyan rural homes (under the Last Mile Connectivity Programme) provides yet more evidence: delocalised electrons in a non-directional lattice produce conductivity, malleability, and ductility that no ionic or covalent material can match.</w:t>
             </w:r>
           </w:p>
           <w:p>
@@ -1285,7 +1513,45 @@
                 <w:sz w:val="18"/>
                 <w:szCs w:val="18"/>
               </w:rPr>
-              <w:t xml:space="preserve">If I were presented with an unfamiliar substance — for example, silicon carbide (SiC), used to coat the edges of cutting tools used by Kenyan jua kali metalworkers — I could now reason as follows: silicon and carbon are both non-metals, so they form covalent bonds; silicon carbide forms a giant three-dimensional covalent network (similar to diamond); therefore it should have a very high melting point, great hardness, no electrical conductivity, and no solubility in water — and indeed it is one of the hardest known materials. This ability to predict and explain properties from first principles, rather than memorising facts about individual substances, is the most important thing I have gained from this unit. Chemical bonding is not just a topic in a chemistry textbook; it is the explanation for why every material in Kenya — and in the entire world — behaves the way it does.</w:t>
+              <w:t xml:space="preserve">However, the models used in this unit are simplifications and have limitations. The Lewis dot diagram model, for example, represents electrons as static dots and does not capture the true quantum-mechanical probability distributions of electrons around atoms. It cannot fully explain the bond angles in molecules like water (104.5°, not 90° as a naive model might suggest) without the addition of VSEPR theory. The giant ionic lattice model treats ions as perfect spheres and ignores the polarisation effects that occur when a large anion is distorted by a small, highly charged cation — effects that matter in real Kenyan industrial chemistry.</w:t>
+            </w:r>
+          </w:p>
+          <w:p>
+            <w:pPr>
+              <w:spacing w:after="40" w:before="0"/>
+              <w:jc w:val="left"/>
+            </w:pPr>
+            <w:r>
+              <w:rPr>
+                <w:rFonts w:ascii="Arial" w:cs="Arial" w:eastAsia="Arial" w:hAnsi="Arial"/>
+                <w:b w:val="false"/>
+                <w:bCs w:val="false"/>
+                <w:i w:val="false"/>
+                <w:iCs w:val="false"/>
+                <w:color w:val="000000"/>
+                <w:sz w:val="18"/>
+                <w:szCs w:val="18"/>
+              </w:rPr>
+              <w:t xml:space="preserve"/>
+            </w:r>
+          </w:p>
+          <w:p>
+            <w:pPr>
+              <w:spacing w:after="40" w:before="0"/>
+              <w:jc w:val="left"/>
+            </w:pPr>
+            <w:r>
+              <w:rPr>
+                <w:rFonts w:ascii="Arial" w:cs="Arial" w:eastAsia="Arial" w:hAnsi="Arial"/>
+                <w:b w:val="false"/>
+                <w:bCs w:val="false"/>
+                <w:i w:val="false"/>
+                <w:iCs w:val="false"/>
+                <w:color w:val="000000"/>
+                <w:sz w:val="18"/>
+                <w:szCs w:val="18"/>
+              </w:rPr>
+              <w:t xml:space="preserve">In Lesson 1, looking at salt, pencil graphite, and a photograph of a diamond blade, the honest answer to the driving question was 'I do not know — they are all solids, so why are they so different?' That uncertainty was the most valuable starting point. Eight lessons later, the answer is no longer a mystery but a framework: identify the bond type, deduce the structure, and the properties follow as logical consequences. This shift — from observing puzzling differences to explaining them with a coherent atomic-scale model — is exactly what doing chemistry means.</w:t>
             </w:r>
           </w:p>
         </w:tc>
@@ -1512,7 +1778,7 @@
                 <w:sz w:val="18"/>
                 <w:szCs w:val="18"/>
               </w:rPr>
-              <w:t xml:space="preserve">Explanation of Bond Types and Structures</w:t>
+              <w:t xml:space="preserve">Accuracy and Depth of Bond-Type Explanation</w:t>
             </w:r>
           </w:p>
         </w:tc>
@@ -1544,7 +1810,7 @@
                 <w:sz w:val="18"/>
                 <w:szCs w:val="18"/>
               </w:rPr>
-              <w:t xml:space="preserve">Excellent (4): Accurately and thoroughly explains all four bond types (ionic, covalent including dative, metallic, and intermolecular forces) with correct particle-level descriptions. Clearly distinguishes giant ionic, giant covalent, simple molecular, and metallic structures. Uses correct scientific vocabulary consistently (lattice, delocalised, electrostatic, octet, etc.).</w:t>
+              <w:t xml:space="preserve">Excellent (4): Correctly and precisely identifies and explains all relevant bond types (ionic, covalent, metallic, giant covalent, intermolecular forces) with accurate descriptions of electron behaviour, structural arrangement, and energy considerations. Uses correct terminology throughout (e.g., delocalised electrons, lattice, electrostatic attraction, lone pair, dative bond) with no factual errors. Explanations demonstrate deep conceptual understanding beyond surface recall.</w:t>
             </w:r>
           </w:p>
         </w:tc>
@@ -1576,7 +1842,7 @@
                 <w:sz w:val="18"/>
                 <w:szCs w:val="18"/>
               </w:rPr>
-              <w:t xml:space="preserve">Proficient (3): Accurately explains at least three bond types with mostly correct particle-level descriptions. Distinguishes between most structure types with minor omissions or imprecision. Uses scientific vocabulary mostly correctly with occasional errors.</w:t>
+              <w:t xml:space="preserve">Proficient (3): Correctly identifies and explains most relevant bond types with generally accurate descriptions of electron behaviour and structure. Minor terminological imprecision or one small factual error present, but overall understanding of bond–property relationships is clearly demonstrated. Core concepts (ionic lattice, sea of electrons, giant covalent network, simple molecular) are all addressed accurately.</w:t>
             </w:r>
           </w:p>
         </w:tc>
@@ -1608,7 +1874,7 @@
                 <w:sz w:val="18"/>
                 <w:szCs w:val="18"/>
               </w:rPr>
-              <w:t xml:space="preserve">Developing (1-2): Explains one or two bond types with significant inaccuracies or confuses bond types with each other. Descriptions are largely at the definition level without particle-level reasoning. Scientific vocabulary is limited or frequently misused.</w:t>
+              <w:t xml:space="preserve">Developing (1–2): Bond types are named but not explained, OR significant factual errors are present (e.g., claiming diamond conducts electricity, or that ionic compounds conduct in the solid state). Structural descriptions are missing or confused. The student lists facts without connecting bond type to structure, or structure to property. Terminology is frequently misused or absent.</w:t>
             </w:r>
           </w:p>
         </w:tc>
@@ -1642,7 +1908,7 @@
                 <w:sz w:val="18"/>
                 <w:szCs w:val="18"/>
               </w:rPr>
-              <w:t xml:space="preserve">Linking Bond Type and Structure to Physical Properties</w:t>
+              <w:t xml:space="preserve">Evidence-Based Reasoning and Connection to the Anchoring Phenomenon</w:t>
             </w:r>
           </w:p>
         </w:tc>
@@ -1674,7 +1940,7 @@
                 <w:sz w:val="18"/>
                 <w:szCs w:val="18"/>
               </w:rPr>
-              <w:t xml:space="preserve">Excellent (4): Clearly and accurately explains how bond type and structure determine at least four physical properties (melting point, electrical conductivity, solubility, and hardness or malleability) using particle-level reasoning. Comparisons between substances (e.g., graphite vs. diamond; NaCl vs. wax) are used effectively to show how structural differences produce property differences. Evidence from experiments in Lessons 3–7 is explicitly cited.</w:t>
+              <w:t xml:space="preserve">Excellent (4): Every major claim is supported by specific evidence drawn from class experiments, Lewis diagrams, investigations, or the DQB. The anchoring phenomenon (salt, graphite, diamond) is explicitly revisited and fully explained using unit concepts. The student constructs a coherent scientific argument that moves from evidence to claim to explanation throughout. The Driving Question is answered with a clear, supported, general claim.</w:t>
             </w:r>
           </w:p>
         </w:tc>
@@ -1706,7 +1972,7 @@
                 <w:sz w:val="18"/>
                 <w:szCs w:val="18"/>
               </w:rPr>
-              <w:t xml:space="preserve">Proficient (3): Explains how bond type and structure determine at least three physical properties with mostly correct particle-level reasoning. Some comparison between substances is attempted. At least one reference to experimental evidence is included, though it may be vague.</w:t>
+              <w:t xml:space="preserve">Proficient (3): Most claims are supported by evidence, and the anchoring phenomenon is addressed in at least one section with reasonable accuracy. The Driving Question is answered but the claim may lack full generality or supporting evidence in one area. The overall argument is logical but may have one gap where a claim is asserted without evidence.</w:t>
             </w:r>
           </w:p>
         </w:tc>
@@ -1738,7 +2004,7 @@
                 <w:sz w:val="18"/>
                 <w:szCs w:val="18"/>
               </w:rPr>
-              <w:t xml:space="preserve">Developing (1-2): Attempts to link bond type to properties but reasoning is largely descriptive rather than explanatory (e.g., 'ionic bonds are strong so ionic substances have high melting points' without particle-level justification). Fewer than three properties are addressed. Little or no reference to experimental evidence.</w:t>
+              <w:t xml:space="preserve">Developing (1–2): Claims are mostly unsupported assertions with little or no reference to experimental evidence, Lewis diagrams, or investigations conducted during the unit. The anchoring phenomenon is mentioned only superficially or not at all. The Driving Question is either not answered or answered with a vague, unsubstantiated statement. The response reads as memorised facts rather than reasoned argument.</w:t>
             </w:r>
           </w:p>
         </w:tc>
@@ -1772,7 +2038,7 @@
                 <w:sz w:val="18"/>
                 <w:szCs w:val="18"/>
               </w:rPr>
-              <w:t xml:space="preserve">Connecting Bond Type and Properties to Real-World Uses</w:t>
+              <w:t xml:space="preserve">Use of Kenyan Contexts and Real-World Application</w:t>
             </w:r>
           </w:p>
         </w:tc>
@@ -1804,7 +2070,7 @@
                 <w:sz w:val="18"/>
                 <w:szCs w:val="18"/>
               </w:rPr>
-              <w:t xml:space="preserve">Excellent (4): Provides at least four specific examples of substances and uses, each with a complete and accurate chain of reasoning (bond type → structure → property → use). At least two examples are clearly drawn from Kenyan everyday life or Kenyan industries, with accurate and specific detail (e.g., naming specific uses such as sufurias, KCSE pencils, mining drills, oral rehydration salts).</w:t>
+              <w:t xml:space="preserve">Excellent (4): At least THREE specific, accurate, and well-integrated Kenyan contexts are used beyond those named in the prompts (e.g., Jua Kali metalwork, SGR railway, Rift Valley farming, Kindaruma hydroelectric, Mombasa coast weather, Iten marathon runners). Each Kenyan example is used to genuinely illuminate a scientific concept — not merely mentioned decoratively. Applications are factually plausible and logically connected to the bond/property being discussed.</w:t>
             </w:r>
           </w:p>
         </w:tc>
@@ -1836,7 +2102,7 @@
                 <w:sz w:val="18"/>
                 <w:szCs w:val="18"/>
               </w:rPr>
-              <w:t xml:space="preserve">Proficient (3): Provides at least three specific examples with mostly complete chains of reasoning. At least one example is drawn from a Kenyan context. The link between property and use is clear, though the link from bond type to structure may be less fully explained in one or two cases.</w:t>
+              <w:t xml:space="preserve">Proficient (3): At least TWO Kenyan contexts are used accurately and are connected to scientific concepts in a meaningful way. The examples are relevant and correctly applied, though the connection between the Kenyan context and the chemistry concept could be made more explicit or precise in one instance.</w:t>
             </w:r>
           </w:p>
         </w:tc>
@@ -1868,7 +2134,7 @@
                 <w:sz w:val="18"/>
                 <w:szCs w:val="18"/>
               </w:rPr>
-              <w:t xml:space="preserve">Developing (1-2): Provides fewer than three examples, or examples lack a complete reasoning chain (e.g., states a use without explaining which property makes the substance suitable, or which bond type produces that property). Kenyan context is absent or superficial.</w:t>
+              <w:t xml:space="preserve">Developing (1–2): Kenyan contexts are absent, OR only one is used superficially (e.g., 'like salt in Kenya'), OR examples are factually incorrect or disconnected from the chemical concept being explained. The student relies entirely on generic Western examples or textbook abstractions with no grounding in Kenyan life or industry.</w:t>
             </w:r>
           </w:p>
         </w:tc>
@@ -1902,7 +2168,7 @@
                 <w:sz w:val="18"/>
                 <w:szCs w:val="18"/>
               </w:rPr>
-              <w:t xml:space="preserve">Anchoring Phenomenon and Driving Question</w:t>
+              <w:t xml:space="preserve">Scientific Vocabulary and Communication Clarity</w:t>
             </w:r>
           </w:p>
         </w:tc>
@@ -1934,7 +2200,7 @@
                 <w:sz w:val="18"/>
                 <w:szCs w:val="18"/>
               </w:rPr>
-              <w:t xml:space="preserve">Excellent (4): Explicitly and accurately returns to the Nairobi student's observations in the anchoring phenomenon to frame or conclude the explanation. Provides a clear, complete, and well-reasoned answer to the driving question that synthesises learning from across the unit. Demonstrates understanding that the bond type → structure → properties → uses chain is a transferable principle by applying it to at least one new or unfamiliar example.</w:t>
+              <w:t xml:space="preserve">Excellent (4): Response meets or exceeds the 300-word minimum and is written in clear, well-organised prose with no use of bullet points. Scientific vocabulary is used correctly and consistently: terms such as electrostatic attraction, delocalised, lattice, lone pair, ion–dipole interaction, dative bond, van der Waals forces, tetrahedral, and giant structure appear accurately in context. Explanations are precise enough that a fellow student who missed the unit could follow and learn from them.</w:t>
             </w:r>
           </w:p>
         </w:tc>
@@ -1966,7 +2232,7 @@
                 <w:sz w:val="18"/>
                 <w:szCs w:val="18"/>
               </w:rPr>
-              <w:t xml:space="preserve">Proficient (3): References the anchoring phenomenon and addresses the driving question, but the connection may be stated rather than fully reasoned. Synthesises learning from most of the unit. Applies the bonding principle to familiar examples but does not clearly extend to a new or unfamiliar substance.</w:t>
+              <w:t xml:space="preserve">Proficient (3): Response meets the 300-word minimum and is written mostly in prose. Scientific vocabulary is generally correct with one or two terms used imprecisely or inconsistently. The overall explanation is clear and followable, though one section may be less well-organised or contain a sentence that is ambiguous in meaning.</w:t>
             </w:r>
           </w:p>
         </w:tc>
@@ -1998,7 +2264,7 @@
                 <w:sz w:val="18"/>
                 <w:szCs w:val="18"/>
               </w:rPr>
-              <w:t xml:space="preserve">Developing (1-2): Makes limited or no reference to the anchoring phenomenon. The driving question is addressed only partially or in a superficial way. The explanation reads as a list of facts about individual substances rather than a synthesis of a unifying principle.</w:t>
+              <w:t xml:space="preserve">Developing (1–2): Response is below 300 words, OR is written primarily in bullet points rather than prose, OR uses scientific vocabulary incorrectly or inconsistently in ways that obscure meaning (e.g., confusing 'bond' with 'force', or 'molecule' with 'atom' throughout). Explanations are unclear, incomplete, or so disorganised that the intended meaning cannot be reliably determined.</w:t>
             </w:r>
           </w:p>
         </w:tc>
@@ -2032,7 +2298,7 @@
                 <w:sz w:val="18"/>
                 <w:szCs w:val="18"/>
               </w:rPr>
-              <w:t xml:space="preserve">Use of Scientific Evidence and Quality of Scientific Communication</w:t>
+              <w:t xml:space="preserve">Model Coherence and Reflective Thinking</w:t>
             </w:r>
           </w:p>
         </w:tc>
@@ -2064,7 +2330,7 @@
                 <w:sz w:val="18"/>
                 <w:szCs w:val="18"/>
               </w:rPr>
-              <w:t xml:space="preserve">Excellent (4): All claims are supported by specific evidence from experiments, observations, or models completed during the unit. The explanation is logically organised, exceeds 300 words, and uses precise scientific vocabulary throughout. Writing is clear, accurate, and demonstrates independent reasoning rather than reproduction of textbook statements.</w:t>
+              <w:t xml:space="preserve">Excellent (4): The student presents a coherent, unified explanatory model across all sections — ideas from different lessons fit together without contradiction. At least one genuine limitation of the models used is identified and explained (e.g., Lewis diagrams do not capture 3D geometry, the ionic model ignores polarisation, the sea-of-electrons model is classical not quantum). The reflection in Section 5 shows authentic intellectual growth: the student describes specifically how their thinking changed and why, not just that it changed.</w:t>
             </w:r>
           </w:p>
         </w:tc>
@@ -2096,7 +2362,7 @@
                 <w:sz w:val="18"/>
                 <w:szCs w:val="18"/>
               </w:rPr>
-              <w:t xml:space="preserve">Proficient (3): Most claims are supported by evidence, with at least two specific references to experimental observations or model-building activities. The explanation meets the 300-word minimum, is mostly logically organised, and uses scientific vocabulary with reasonable accuracy. Occasional reliance on textbook-style phrasing.</w:t>
+              <w:t xml:space="preserve">Proficient (3): The explanatory model is mostly coherent with no major contradictions between sections. A limitation of one model is identified, though it may be stated without full explanation. The reflection shows some genuine self-awareness about learning progress, but may be brief or somewhat generic ('I now understand bonds better than before').</w:t>
             </w:r>
           </w:p>
         </w:tc>
@@ -2128,7 +2394,7 @@
                 <w:sz w:val="18"/>
                 <w:szCs w:val="18"/>
               </w:rPr>
-              <w:t xml:space="preserve">Developing (1-2): Few or no claims are supported by specific evidence. The explanation may be below 300 words, poorly organised, or consist primarily of definitions and textbook statements without original reasoning. Scientific vocabulary is limited or used inaccurately.</w:t>
+              <w:t xml:space="preserve">Developing (1–2): The responses across sections are inconsistent or contradictory (e.g., claiming in one section that NaCl conducts as a solid and in another that it does not). No model limitation is identified, OR the limitation stated is itself factually incorrect. Reflection is absent or consists only of a single vague sentence ('I learned a lot about chemistry').</w:t>
             </w:r>
           </w:p>
         </w:tc>

</xml_diff>